<commit_message>
Almost done with lesson plan
</commit_message>
<xml_diff>
--- a/Science Teaching/TA guide_template_ver2.docx
+++ b/Science Teaching/TA guide_template_ver2.docx
@@ -11,7 +11,7 @@
     </w:p>
     <w:p>
       <w:pPr>
-        <w:pStyle w:val="Titel"/>
+        <w:pStyle w:val="Title"/>
         <w:rPr>
           <w:lang w:val="en-GB"/>
         </w:rPr>
@@ -74,7 +74,7 @@
     </w:p>
     <w:tbl>
       <w:tblPr>
-        <w:tblStyle w:val="Tabel-Gitter"/>
+        <w:tblStyle w:val="TableGrid"/>
         <w:tblW w:w="0" w:type="auto"/>
         <w:tblLook w:val="04A0" w:firstRow="1" w:lastRow="0" w:firstColumn="1" w:lastColumn="0" w:noHBand="0" w:noVBand="1"/>
       </w:tblPr>
@@ -94,7 +94,7 @@
           </w:tcPr>
           <w:p>
             <w:pPr>
-              <w:pStyle w:val="Titel"/>
+              <w:pStyle w:val="Title"/>
               <w:rPr>
                 <w:b/>
                 <w:bCs/>
@@ -123,7 +123,7 @@
           </w:tcPr>
           <w:p>
             <w:pPr>
-              <w:pStyle w:val="Titel"/>
+              <w:pStyle w:val="Title"/>
               <w:rPr>
                 <w:sz w:val="24"/>
                 <w:szCs w:val="24"/>
@@ -146,7 +146,7 @@
           </w:tcPr>
           <w:p>
             <w:pPr>
-              <w:pStyle w:val="Titel"/>
+              <w:pStyle w:val="Title"/>
               <w:ind w:left="1304" w:hanging="1304"/>
               <w:rPr>
                 <w:sz w:val="24"/>
@@ -172,7 +172,7 @@
           </w:tcPr>
           <w:p>
             <w:pPr>
-              <w:pStyle w:val="Titel"/>
+              <w:pStyle w:val="Title"/>
               <w:rPr>
                 <w:sz w:val="24"/>
                 <w:szCs w:val="24"/>
@@ -195,7 +195,7 @@
           </w:tcPr>
           <w:p>
             <w:pPr>
-              <w:pStyle w:val="Titel"/>
+              <w:pStyle w:val="Title"/>
               <w:rPr>
                 <w:sz w:val="24"/>
                 <w:szCs w:val="24"/>
@@ -220,7 +220,7 @@
           </w:tcPr>
           <w:p>
             <w:pPr>
-              <w:pStyle w:val="Titel"/>
+              <w:pStyle w:val="Title"/>
               <w:rPr>
                 <w:sz w:val="24"/>
                 <w:szCs w:val="24"/>
@@ -251,7 +251,7 @@
           </w:tcPr>
           <w:p>
             <w:pPr>
-              <w:pStyle w:val="Titel"/>
+              <w:pStyle w:val="Title"/>
               <w:rPr>
                 <w:sz w:val="24"/>
                 <w:szCs w:val="24"/>
@@ -264,7 +264,7 @@
                 <w:szCs w:val="24"/>
                 <w:lang w:val="en-GB"/>
               </w:rPr>
-              <w:t>~12</w:t>
+              <w:t>10-15</w:t>
             </w:r>
           </w:p>
         </w:tc>
@@ -276,7 +276,7 @@
           </w:tcPr>
           <w:p>
             <w:pPr>
-              <w:pStyle w:val="Titel"/>
+              <w:pStyle w:val="Title"/>
               <w:rPr>
                 <w:sz w:val="24"/>
                 <w:szCs w:val="24"/>
@@ -307,7 +307,7 @@
           </w:tcPr>
           <w:p>
             <w:pPr>
-              <w:pStyle w:val="Titel"/>
+              <w:pStyle w:val="Title"/>
               <w:rPr>
                 <w:sz w:val="24"/>
                 <w:szCs w:val="24"/>
@@ -332,7 +332,7 @@
           </w:tcPr>
           <w:p>
             <w:pPr>
-              <w:pStyle w:val="Titel"/>
+              <w:pStyle w:val="Title"/>
               <w:rPr>
                 <w:sz w:val="24"/>
                 <w:szCs w:val="24"/>
@@ -355,7 +355,7 @@
           </w:tcPr>
           <w:p>
             <w:pPr>
-              <w:pStyle w:val="Titel"/>
+              <w:pStyle w:val="Title"/>
               <w:rPr>
                 <w:sz w:val="24"/>
                 <w:szCs w:val="24"/>
@@ -383,7 +383,7 @@
           </w:tcPr>
           <w:p>
             <w:pPr>
-              <w:pStyle w:val="Titel"/>
+              <w:pStyle w:val="Title"/>
               <w:rPr>
                 <w:sz w:val="24"/>
                 <w:szCs w:val="24"/>
@@ -454,7 +454,7 @@
           </w:tcPr>
           <w:p>
             <w:pPr>
-              <w:pStyle w:val="Titel"/>
+              <w:pStyle w:val="Title"/>
               <w:rPr>
                 <w:sz w:val="24"/>
                 <w:szCs w:val="24"/>
@@ -479,7 +479,7 @@
           </w:tcPr>
           <w:p>
             <w:pPr>
-              <w:pStyle w:val="Titel"/>
+              <w:pStyle w:val="Title"/>
               <w:rPr>
                 <w:sz w:val="24"/>
                 <w:szCs w:val="24"/>
@@ -534,7 +534,7 @@
           </w:tcPr>
           <w:p>
             <w:pPr>
-              <w:pStyle w:val="Titel"/>
+              <w:pStyle w:val="Title"/>
               <w:rPr>
                 <w:sz w:val="24"/>
                 <w:szCs w:val="24"/>
@@ -562,7 +562,7 @@
     </w:p>
     <w:p>
       <w:pPr>
-        <w:pStyle w:val="Overskrift1"/>
+        <w:pStyle w:val="Heading1"/>
       </w:pPr>
       <w:r>
         <w:t>The initiative which was implemented in this lesson</w:t>
@@ -587,35 +587,68 @@
     </w:p>
     <w:p>
       <w:pPr>
-        <w:pStyle w:val="Overskrift1"/>
-      </w:pPr>
-      <w:r>
-        <w:t>My reasons for choosing this initiative (problem and aim)</w:t>
+        <w:rPr>
+          <w:i/>
+          <w:iCs/>
+          <w:lang w:val="en-GB"/>
+        </w:rPr>
+      </w:pPr>
+      <w:r>
+        <w:rPr>
+          <w:i/>
+          <w:iCs/>
+          <w:lang w:val="en-GB"/>
+        </w:rPr>
+        <w:t xml:space="preserve">The initiative will specifically consist of </w:t>
+      </w:r>
+      <w:r>
+        <w:rPr>
+          <w:i/>
+          <w:iCs/>
+          <w:lang w:val="en-GB"/>
+        </w:rPr>
+        <w:t xml:space="preserve">implementing, usually, one teaching activity per lesson. This activity will be chosen from a pool of suitable </w:t>
+      </w:r>
+      <w:r>
+        <w:rPr>
+          <w:i/>
+          <w:iCs/>
+          <w:lang w:val="en-GB"/>
+        </w:rPr>
+        <w:t>activities such as think-pair-share, thinking classroom, ticket out the door,</w:t>
+      </w:r>
+      <w:r>
+        <w:rPr>
+          <w:i/>
+          <w:iCs/>
+          <w:lang w:val="en-GB"/>
+        </w:rPr>
+        <w:t xml:space="preserve"> WRITE MORE ACTIVITIES</w:t>
       </w:r>
     </w:p>
     <w:p>
       <w:pPr>
-        <w:rPr>
-          <w:i/>
-          <w:iCs/>
-          <w:lang w:val="en-GB"/>
-        </w:rPr>
-      </w:pPr>
-      <w:r>
-        <w:rPr>
-          <w:i/>
-          <w:iCs/>
-          <w:lang w:val="en-GB"/>
-        </w:rPr>
-        <w:t xml:space="preserve">Describe the challenge you are addressing and the aim you are pursuing with regards to students learning. Also make sure to argue why you have chosen this specific initiative. </w:t>
+        <w:pStyle w:val="Heading1"/>
+      </w:pPr>
+      <w:r>
+        <w:t>My reasons for choosing this initiative (problem and aim)</w:t>
       </w:r>
     </w:p>
     <w:p>
       <w:pPr>
-        <w:pStyle w:val="Overskrift1"/>
-      </w:pPr>
-      <w:r>
-        <w:t>What students should learn during this lesson</w:t>
+        <w:rPr>
+          <w:i/>
+          <w:iCs/>
+          <w:lang w:val="en-GB"/>
+        </w:rPr>
+      </w:pPr>
+      <w:r>
+        <w:rPr>
+          <w:i/>
+          <w:iCs/>
+          <w:lang w:val="en-GB"/>
+        </w:rPr>
+        <w:t xml:space="preserve">The classes in this course are traditionally taught by having students present solutions one at a time at the blackboard. This method is slow, uncomfortable, and does not activate many students at a time, since the students watching will zone out and refuse to participate. </w:t>
       </w:r>
     </w:p>
     <w:p>
@@ -632,15 +665,58 @@
           <w:iCs/>
           <w:lang w:val="en-GB"/>
         </w:rPr>
-        <w:t>Shortly describe what students are intended to learn during this lesson. Make sure to include both the topic (content) and the skills.</w:t>
+        <w:t xml:space="preserve">The program and exercises in the course are laid out for all weeks in advance, meaning there is low flexibility in choice of tasks. </w:t>
+      </w:r>
+      <w:r>
+        <w:rPr>
+          <w:i/>
+          <w:iCs/>
+          <w:lang w:val="en-GB"/>
+        </w:rPr>
+        <w:t xml:space="preserve">The nature of the tasks furthermore </w:t>
+      </w:r>
+      <w:r>
+        <w:rPr>
+          <w:i/>
+          <w:iCs/>
+          <w:lang w:val="en-GB"/>
+        </w:rPr>
+        <w:t>usually requires the students to calculate the tasks in sequence, since each subtask builds upon the previous, meaning that work can often not be split up.</w:t>
       </w:r>
     </w:p>
     <w:p>
       <w:pPr>
-        <w:pStyle w:val="Overskrift1"/>
-      </w:pPr>
-      <w:r>
-        <w:t xml:space="preserve">How this lesson is usually taught </w:t>
+        <w:rPr>
+          <w:i/>
+          <w:iCs/>
+          <w:lang w:val="en-GB"/>
+        </w:rPr>
+      </w:pPr>
+      <w:r>
+        <w:rPr>
+          <w:i/>
+          <w:iCs/>
+          <w:lang w:val="en-GB"/>
+        </w:rPr>
+        <w:t xml:space="preserve">My aim is to stimulate conversation and creative thinking among the students for them to explore, create, and challenge ideas. I want to change their perception of mathematical problem solving to a more social one where other </w:t>
+      </w:r>
+      <w:proofErr w:type="gramStart"/>
+      <w:r>
+        <w:rPr>
+          <w:i/>
+          <w:iCs/>
+          <w:lang w:val="en-GB"/>
+        </w:rPr>
+        <w:t>students</w:t>
+      </w:r>
+      <w:proofErr w:type="gramEnd"/>
+      <w:r>
+        <w:rPr>
+          <w:i/>
+          <w:iCs/>
+          <w:lang w:val="en-GB"/>
+        </w:rPr>
+        <w:t xml:space="preserve"> are partners and where it is okay to be wrong most of the time, because they'll learn from their mistakes.</w:t>
       </w:r>
     </w:p>
     <w:p>
@@ -657,15 +733,24 @@
           <w:iCs/>
           <w:lang w:val="en-GB"/>
         </w:rPr>
-        <w:t xml:space="preserve">Share a short lesson plan illustrating the teaching before your initiative. Maybe you can reuse the lesson plan you made in task 2.2. </w:t>
+        <w:t>I have chosen this initiative because it forces students to cooperate with each other, have an actual conversation, and because it takes off some of the pressure of presenting. There is also richer opportunity for the students to reflect upon their learning processes.</w:t>
+      </w:r>
+      <w:r>
+        <w:rPr>
+          <w:i/>
+          <w:iCs/>
+          <w:lang w:val="en-GB"/>
+        </w:rPr>
+        <w:t xml:space="preserve"> </w:t>
       </w:r>
     </w:p>
     <w:p>
       <w:pPr>
-        <w:pStyle w:val="Overskrift1"/>
-      </w:pPr>
-      <w:r>
-        <w:t>How I intended to teach the lesson and the purpose of each step</w:t>
+        <w:pStyle w:val="Heading1"/>
+      </w:pPr>
+      <w:r>
+        <w:lastRenderedPageBreak/>
+        <w:t>What students should learn during this lesson</w:t>
       </w:r>
     </w:p>
     <w:p>
@@ -682,12 +767,1968 @@
           <w:iCs/>
           <w:lang w:val="en-GB"/>
         </w:rPr>
-        <w:t>Share a lesson plan where you describe the purpose of each activity in the lesson. Make sure to describe 1) what students do and what you do and 2) how each step support students learning</w:t>
+        <w:t xml:space="preserve">Since this is an overarching initiative there is no specific learning goal. In terms of subject matter, the students should learn how to solve tasks which are </w:t>
+      </w:r>
+      <w:proofErr w:type="gramStart"/>
+      <w:r>
+        <w:rPr>
+          <w:i/>
+          <w:iCs/>
+          <w:lang w:val="en-GB"/>
+        </w:rPr>
+        <w:t>similar to</w:t>
+      </w:r>
+      <w:proofErr w:type="gramEnd"/>
+      <w:r>
+        <w:rPr>
+          <w:i/>
+          <w:iCs/>
+          <w:lang w:val="en-GB"/>
+        </w:rPr>
+        <w:t xml:space="preserve"> the exam questions, preparing them for these. On a more meta level, students should learn how to tackle mathematical problems alone and in cooperation to increase their learning, productivity, and, </w:t>
+      </w:r>
+      <w:proofErr w:type="gramStart"/>
+      <w:r>
+        <w:rPr>
+          <w:i/>
+          <w:iCs/>
+          <w:lang w:val="en-GB"/>
+        </w:rPr>
+        <w:t>last but not least</w:t>
+      </w:r>
+      <w:proofErr w:type="gramEnd"/>
+      <w:r>
+        <w:rPr>
+          <w:i/>
+          <w:iCs/>
+          <w:lang w:val="en-GB"/>
+        </w:rPr>
+        <w:t>, their enjoyment of the process.</w:t>
       </w:r>
     </w:p>
     <w:p>
       <w:pPr>
-        <w:pStyle w:val="Overskrift1"/>
+        <w:rPr>
+          <w:i/>
+          <w:iCs/>
+          <w:lang w:val="en-GB"/>
+        </w:rPr>
+      </w:pPr>
+      <w:r>
+        <w:rPr>
+          <w:i/>
+          <w:iCs/>
+          <w:lang w:val="en-GB"/>
+        </w:rPr>
+        <w:t xml:space="preserve">The tasks are usually of the format where an assumption, mathematical model or expression, or some data is given. The students then must either prove a theorem or a property, derive an expression, fit a model to data, or interpret results, either visually or quantitatively. </w:t>
+      </w:r>
+    </w:p>
+    <w:p>
+      <w:pPr>
+        <w:pStyle w:val="Heading1"/>
+      </w:pPr>
+      <w:r>
+        <w:t xml:space="preserve">How this lesson is usually taught </w:t>
+      </w:r>
+    </w:p>
+    <w:p>
+      <w:pPr>
+        <w:rPr>
+          <w:i/>
+          <w:iCs/>
+          <w:lang w:val="en-GB"/>
+        </w:rPr>
+      </w:pPr>
+      <w:r>
+        <w:rPr>
+          <w:i/>
+          <w:iCs/>
+          <w:lang w:val="en-GB"/>
+        </w:rPr>
+        <w:t xml:space="preserve">Share a short lesson plan illustrating the teaching before your initiative. Maybe you can reuse the lesson plan you made in task 2.2. </w:t>
+      </w:r>
+    </w:p>
+    <w:tbl>
+      <w:tblPr>
+        <w:tblStyle w:val="TableGrid"/>
+        <w:tblpPr w:leftFromText="141" w:rightFromText="141" w:vertAnchor="text" w:horzAnchor="margin" w:tblpY="121"/>
+        <w:tblW w:w="9072" w:type="dxa"/>
+        <w:tblBorders>
+          <w:top w:val="none" w:sz="0" w:space="0" w:color="auto"/>
+          <w:left w:val="none" w:sz="0" w:space="0" w:color="auto"/>
+          <w:bottom w:val="none" w:sz="0" w:space="0" w:color="auto"/>
+          <w:right w:val="none" w:sz="0" w:space="0" w:color="auto"/>
+          <w:insideH w:val="none" w:sz="0" w:space="0" w:color="auto"/>
+          <w:insideV w:val="none" w:sz="0" w:space="0" w:color="auto"/>
+        </w:tblBorders>
+        <w:tblLook w:val="04A0" w:firstRow="1" w:lastRow="0" w:firstColumn="1" w:lastColumn="0" w:noHBand="0" w:noVBand="1"/>
+      </w:tblPr>
+      <w:tblGrid>
+        <w:gridCol w:w="990"/>
+        <w:gridCol w:w="2691"/>
+        <w:gridCol w:w="1701"/>
+        <w:gridCol w:w="3690"/>
+      </w:tblGrid>
+      <w:tr>
+        <w:trPr>
+          <w:trHeight w:val="953"/>
+        </w:trPr>
+        <w:tc>
+          <w:tcPr>
+            <w:tcW w:w="9072" w:type="dxa"/>
+            <w:gridSpan w:val="4"/>
+            <w:tcBorders>
+              <w:top w:val="single" w:sz="4" w:space="0" w:color="auto"/>
+              <w:left w:val="single" w:sz="4" w:space="0" w:color="auto"/>
+              <w:bottom w:val="single" w:sz="4" w:space="0" w:color="auto"/>
+              <w:right w:val="single" w:sz="4" w:space="0" w:color="auto"/>
+            </w:tcBorders>
+            <w:shd w:val="clear" w:color="auto" w:fill="ED7D31" w:themeFill="accent2"/>
+          </w:tcPr>
+          <w:p>
+            <w:pPr>
+              <w:rPr>
+                <w:rFonts w:cs="Arial"/>
+                <w:b/>
+                <w:color w:val="FFFFFF" w:themeColor="background1"/>
+                <w:sz w:val="28"/>
+                <w:szCs w:val="28"/>
+              </w:rPr>
+            </w:pPr>
+            <w:r>
+              <w:rPr>
+                <w:rFonts w:cs="Arial"/>
+                <w:b/>
+                <w:color w:val="FFFFFF" w:themeColor="background1"/>
+                <w:sz w:val="28"/>
+                <w:szCs w:val="28"/>
+              </w:rPr>
+              <w:t>Lesson plan template</w:t>
+            </w:r>
+          </w:p>
+          <w:p>
+            <w:pPr>
+              <w:rPr>
+                <w:rFonts w:cs="Arial"/>
+                <w:i/>
+                <w:iCs/>
+                <w:color w:val="FFFFFF" w:themeColor="background1"/>
+              </w:rPr>
+            </w:pPr>
+            <w:r>
+              <w:rPr>
+                <w:rFonts w:cs="Arial"/>
+                <w:i/>
+                <w:iCs/>
+                <w:color w:val="FFFFFF" w:themeColor="background1"/>
+              </w:rPr>
+              <w:t>Example and description guide see below</w:t>
+            </w:r>
+          </w:p>
+          <w:p>
+            <w:pPr>
+              <w:rPr>
+                <w:rFonts w:cs="Arial"/>
+                <w:color w:val="FFFFFF" w:themeColor="background1"/>
+              </w:rPr>
+            </w:pPr>
+          </w:p>
+          <w:p>
+            <w:pPr>
+              <w:rPr>
+                <w:rFonts w:cs="Arial"/>
+                <w:i/>
+                <w:iCs/>
+                <w:color w:val="FFFFFF" w:themeColor="background1"/>
+                <w:sz w:val="16"/>
+                <w:szCs w:val="16"/>
+              </w:rPr>
+            </w:pPr>
+            <w:r>
+              <w:rPr>
+                <w:rFonts w:cs="Arial"/>
+                <w:i/>
+                <w:iCs/>
+                <w:color w:val="FFFFFF" w:themeColor="background1"/>
+                <w:sz w:val="16"/>
+                <w:szCs w:val="16"/>
+              </w:rPr>
+              <w:t>Use the lesson plan as a guide for your teaching session. The purpose is not to script every minute but to make your teaching intentions explicit and help you prepare purposeful learning activities.</w:t>
+            </w:r>
+            <w:r>
+              <w:rPr>
+                <w:rFonts w:cs="Arial"/>
+                <w:i/>
+                <w:iCs/>
+                <w:color w:val="FFFFFF" w:themeColor="background1"/>
+                <w:sz w:val="16"/>
+                <w:szCs w:val="16"/>
+              </w:rPr>
+              <w:t xml:space="preserve"> See writing guide below if needed.</w:t>
+            </w:r>
+          </w:p>
+          <w:p>
+            <w:pPr>
+              <w:tabs>
+                <w:tab w:val="left" w:pos="2560"/>
+              </w:tabs>
+              <w:rPr>
+                <w:rFonts w:cs="Arial"/>
+              </w:rPr>
+            </w:pPr>
+            <w:r>
+              <w:rPr>
+                <w:rFonts w:cs="Arial"/>
+              </w:rPr>
+              <w:tab/>
+            </w:r>
+          </w:p>
+        </w:tc>
+      </w:tr>
+      <w:tr>
+        <w:trPr>
+          <w:trHeight w:val="575"/>
+        </w:trPr>
+        <w:tc>
+          <w:tcPr>
+            <w:tcW w:w="990" w:type="dxa"/>
+            <w:tcBorders>
+              <w:top w:val="single" w:sz="4" w:space="0" w:color="ED7D31" w:themeColor="accent2"/>
+              <w:bottom w:val="single" w:sz="4" w:space="0" w:color="ED7D31" w:themeColor="accent2"/>
+              <w:right w:val="single" w:sz="4" w:space="0" w:color="auto"/>
+            </w:tcBorders>
+            <w:shd w:val="clear" w:color="auto" w:fill="ED7D31" w:themeFill="accent2"/>
+          </w:tcPr>
+          <w:p>
+            <w:pPr>
+              <w:rPr>
+                <w:rFonts w:cs="Arial"/>
+              </w:rPr>
+            </w:pPr>
+            <w:r>
+              <w:rPr>
+                <w:rFonts w:cs="Arial"/>
+                <w:b/>
+                <w:color w:val="FFFFFF" w:themeColor="background1"/>
+              </w:rPr>
+              <w:t>TIME</w:t>
+            </w:r>
+          </w:p>
+        </w:tc>
+        <w:tc>
+          <w:tcPr>
+            <w:tcW w:w="2691" w:type="dxa"/>
+            <w:tcBorders>
+              <w:top w:val="single" w:sz="4" w:space="0" w:color="auto"/>
+              <w:left w:val="single" w:sz="4" w:space="0" w:color="auto"/>
+              <w:bottom w:val="single" w:sz="4" w:space="0" w:color="auto"/>
+              <w:right w:val="single" w:sz="4" w:space="0" w:color="auto"/>
+            </w:tcBorders>
+            <w:shd w:val="clear" w:color="auto" w:fill="ED7D31" w:themeFill="accent2"/>
+          </w:tcPr>
+          <w:p>
+            <w:pPr>
+              <w:rPr>
+                <w:rFonts w:cs="Arial"/>
+              </w:rPr>
+            </w:pPr>
+            <w:r>
+              <w:rPr>
+                <w:rFonts w:cs="Arial"/>
+                <w:b/>
+                <w:color w:val="FFFFFF" w:themeColor="background1"/>
+              </w:rPr>
+              <w:t>ACTIVITY</w:t>
+            </w:r>
+          </w:p>
+        </w:tc>
+        <w:tc>
+          <w:tcPr>
+            <w:tcW w:w="1701" w:type="dxa"/>
+            <w:tcBorders>
+              <w:top w:val="single" w:sz="4" w:space="0" w:color="auto"/>
+              <w:left w:val="single" w:sz="4" w:space="0" w:color="auto"/>
+              <w:bottom w:val="single" w:sz="4" w:space="0" w:color="auto"/>
+              <w:right w:val="single" w:sz="4" w:space="0" w:color="auto"/>
+            </w:tcBorders>
+            <w:shd w:val="clear" w:color="auto" w:fill="ED7D31" w:themeFill="accent2"/>
+          </w:tcPr>
+          <w:p>
+            <w:pPr>
+              <w:rPr>
+                <w:rFonts w:cs="Arial"/>
+              </w:rPr>
+            </w:pPr>
+            <w:r>
+              <w:rPr>
+                <w:rFonts w:cs="Arial"/>
+                <w:b/>
+                <w:color w:val="FFFFFF" w:themeColor="background1"/>
+              </w:rPr>
+              <w:t>WHO IS ACTIVE</w:t>
+            </w:r>
+          </w:p>
+        </w:tc>
+        <w:tc>
+          <w:tcPr>
+            <w:tcW w:w="3690" w:type="dxa"/>
+            <w:tcBorders>
+              <w:top w:val="single" w:sz="4" w:space="0" w:color="auto"/>
+              <w:left w:val="single" w:sz="4" w:space="0" w:color="auto"/>
+              <w:bottom w:val="single" w:sz="4" w:space="0" w:color="auto"/>
+              <w:right w:val="single" w:sz="4" w:space="0" w:color="auto"/>
+            </w:tcBorders>
+            <w:shd w:val="clear" w:color="auto" w:fill="ED7D31" w:themeFill="accent2"/>
+          </w:tcPr>
+          <w:p>
+            <w:pPr>
+              <w:rPr>
+                <w:rFonts w:cs="Arial"/>
+              </w:rPr>
+            </w:pPr>
+            <w:r>
+              <w:rPr>
+                <w:rFonts w:cs="Arial"/>
+                <w:b/>
+                <w:color w:val="FFFFFF" w:themeColor="background1"/>
+              </w:rPr>
+              <w:t>HOW DOES IT SUPPORT STUDENT LEARNING</w:t>
+            </w:r>
+          </w:p>
+        </w:tc>
+      </w:tr>
+      <w:tr>
+        <w:trPr>
+          <w:trHeight w:val="287"/>
+        </w:trPr>
+        <w:tc>
+          <w:tcPr>
+            <w:tcW w:w="990" w:type="dxa"/>
+            <w:tcBorders>
+              <w:top w:val="single" w:sz="4" w:space="0" w:color="ED7D31" w:themeColor="accent2"/>
+              <w:bottom w:val="single" w:sz="4" w:space="0" w:color="ED7D31" w:themeColor="accent2"/>
+              <w:right w:val="single" w:sz="4" w:space="0" w:color="ED7D31" w:themeColor="accent2"/>
+            </w:tcBorders>
+            <w:shd w:val="clear" w:color="auto" w:fill="FFFFFF" w:themeFill="background1"/>
+          </w:tcPr>
+          <w:p>
+            <w:pPr>
+              <w:rPr>
+                <w:rFonts w:cs="Arial"/>
+              </w:rPr>
+            </w:pPr>
+            <w:r>
+              <w:rPr>
+                <w:rFonts w:cs="Arial"/>
+              </w:rPr>
+              <w:t>14:15</w:t>
+            </w:r>
+          </w:p>
+        </w:tc>
+        <w:tc>
+          <w:tcPr>
+            <w:tcW w:w="2691" w:type="dxa"/>
+            <w:tcBorders>
+              <w:top w:val="single" w:sz="4" w:space="0" w:color="auto"/>
+              <w:left w:val="single" w:sz="4" w:space="0" w:color="ED7D31" w:themeColor="accent2"/>
+              <w:bottom w:val="single" w:sz="4" w:space="0" w:color="ED7D31" w:themeColor="accent2"/>
+              <w:right w:val="single" w:sz="4" w:space="0" w:color="ED7D31" w:themeColor="accent2"/>
+            </w:tcBorders>
+            <w:shd w:val="clear" w:color="auto" w:fill="FFFFFF" w:themeFill="background1"/>
+          </w:tcPr>
+          <w:p>
+            <w:pPr>
+              <w:spacing w:before="0"/>
+              <w:rPr>
+                <w:rFonts w:cs="Arial"/>
+                <w:b/>
+                <w:bCs/>
+              </w:rPr>
+            </w:pPr>
+            <w:r>
+              <w:rPr>
+                <w:rFonts w:cs="Arial"/>
+                <w:b/>
+                <w:bCs/>
+              </w:rPr>
+              <w:t>Introduction</w:t>
+            </w:r>
+          </w:p>
+          <w:p>
+            <w:pPr>
+              <w:spacing w:before="0"/>
+              <w:rPr>
+                <w:rFonts w:cs="Arial"/>
+              </w:rPr>
+            </w:pPr>
+            <w:r>
+              <w:rPr>
+                <w:rFonts w:cs="Arial"/>
+              </w:rPr>
+              <w:t xml:space="preserve">Introduction to the </w:t>
+            </w:r>
+            <w:r>
+              <w:rPr>
+                <w:rFonts w:cs="Arial"/>
+              </w:rPr>
+              <w:t xml:space="preserve">format </w:t>
+            </w:r>
+            <w:r>
+              <w:rPr>
+                <w:rFonts w:cs="Arial"/>
+              </w:rPr>
+              <w:t xml:space="preserve">of today’s lecture </w:t>
+            </w:r>
+            <w:r>
+              <w:rPr>
+                <w:rFonts w:cs="Arial"/>
+              </w:rPr>
+              <w:t>and the goals of the overall task</w:t>
+            </w:r>
+            <w:r>
+              <w:rPr>
+                <w:rFonts w:cs="Arial"/>
+              </w:rPr>
+              <w:t>s</w:t>
+            </w:r>
+            <w:r>
+              <w:rPr>
+                <w:rFonts w:cs="Arial"/>
+              </w:rPr>
+              <w:t xml:space="preserve"> and subtasks.</w:t>
+            </w:r>
+          </w:p>
+          <w:p>
+            <w:pPr>
+              <w:spacing w:before="0"/>
+              <w:rPr>
+                <w:rFonts w:cs="Arial"/>
+              </w:rPr>
+            </w:pPr>
+            <w:r>
+              <w:rPr>
+                <w:rFonts w:cs="Arial"/>
+              </w:rPr>
+              <w:t>The students are divided into pairs and pairs of pairs.</w:t>
+            </w:r>
+          </w:p>
+        </w:tc>
+        <w:tc>
+          <w:tcPr>
+            <w:tcW w:w="1701" w:type="dxa"/>
+            <w:tcBorders>
+              <w:top w:val="single" w:sz="4" w:space="0" w:color="auto"/>
+              <w:left w:val="single" w:sz="4" w:space="0" w:color="ED7D31" w:themeColor="accent2"/>
+              <w:bottom w:val="single" w:sz="4" w:space="0" w:color="ED7D31" w:themeColor="accent2"/>
+              <w:right w:val="single" w:sz="4" w:space="0" w:color="ED7D31" w:themeColor="accent2"/>
+            </w:tcBorders>
+            <w:shd w:val="clear" w:color="auto" w:fill="FFFFFF" w:themeFill="background1"/>
+          </w:tcPr>
+          <w:p>
+            <w:pPr>
+              <w:spacing w:before="0"/>
+              <w:rPr>
+                <w:rFonts w:cs="Arial"/>
+              </w:rPr>
+            </w:pPr>
+            <w:r>
+              <w:rPr>
+                <w:rFonts w:cs="Arial"/>
+              </w:rPr>
+              <w:t>TA</w:t>
+            </w:r>
+          </w:p>
+        </w:tc>
+        <w:tc>
+          <w:tcPr>
+            <w:tcW w:w="3690" w:type="dxa"/>
+            <w:tcBorders>
+              <w:top w:val="single" w:sz="4" w:space="0" w:color="auto"/>
+              <w:left w:val="single" w:sz="4" w:space="0" w:color="ED7D31" w:themeColor="accent2"/>
+              <w:bottom w:val="single" w:sz="4" w:space="0" w:color="ED7D31" w:themeColor="accent2"/>
+            </w:tcBorders>
+            <w:shd w:val="clear" w:color="auto" w:fill="FFFFFF" w:themeFill="background1"/>
+          </w:tcPr>
+          <w:p>
+            <w:pPr>
+              <w:rPr>
+                <w:rFonts w:cs="Arial"/>
+              </w:rPr>
+            </w:pPr>
+            <w:r>
+              <w:rPr>
+                <w:rFonts w:cs="Arial"/>
+              </w:rPr>
+              <w:t>Students get an overview of te lecture making it predictable. The exercises are put into a perspective which gives a better foundation for understanding the relevance and helps using them in a more intuitive way.</w:t>
+            </w:r>
+          </w:p>
+        </w:tc>
+      </w:tr>
+      <w:tr>
+        <w:trPr>
+          <w:trHeight w:val="272"/>
+        </w:trPr>
+        <w:tc>
+          <w:tcPr>
+            <w:tcW w:w="990" w:type="dxa"/>
+            <w:tcBorders>
+              <w:top w:val="single" w:sz="4" w:space="0" w:color="ED7D31" w:themeColor="accent2"/>
+              <w:bottom w:val="single" w:sz="4" w:space="0" w:color="ED7D31" w:themeColor="accent2"/>
+              <w:right w:val="single" w:sz="4" w:space="0" w:color="ED7D31" w:themeColor="accent2"/>
+            </w:tcBorders>
+            <w:shd w:val="clear" w:color="auto" w:fill="FFFFFF" w:themeFill="background1"/>
+          </w:tcPr>
+          <w:p>
+            <w:pPr>
+              <w:rPr>
+                <w:rFonts w:cs="Arial"/>
+              </w:rPr>
+            </w:pPr>
+          </w:p>
+        </w:tc>
+        <w:tc>
+          <w:tcPr>
+            <w:tcW w:w="2691" w:type="dxa"/>
+            <w:tcBorders>
+              <w:top w:val="single" w:sz="4" w:space="0" w:color="ED7D31" w:themeColor="accent2"/>
+              <w:left w:val="single" w:sz="4" w:space="0" w:color="ED7D31" w:themeColor="accent2"/>
+              <w:bottom w:val="single" w:sz="4" w:space="0" w:color="ED7D31" w:themeColor="accent2"/>
+              <w:right w:val="single" w:sz="4" w:space="0" w:color="ED7D31" w:themeColor="accent2"/>
+            </w:tcBorders>
+            <w:shd w:val="clear" w:color="auto" w:fill="FFFFFF" w:themeFill="background1"/>
+          </w:tcPr>
+          <w:p>
+            <w:pPr>
+              <w:rPr>
+                <w:rFonts w:cs="Arial"/>
+                <w:b/>
+                <w:bCs/>
+              </w:rPr>
+            </w:pPr>
+            <w:r>
+              <w:rPr>
+                <w:rFonts w:cs="Arial"/>
+                <w:b/>
+                <w:bCs/>
+              </w:rPr>
+              <w:t>Activate knowledge</w:t>
+            </w:r>
+            <w:r>
+              <w:rPr>
+                <w:rFonts w:cs="Arial"/>
+                <w:b/>
+                <w:bCs/>
+              </w:rPr>
+              <w:br/>
+            </w:r>
+            <w:r>
+              <w:rPr>
+                <w:rFonts w:cs="Arial"/>
+              </w:rPr>
+              <w:t xml:space="preserve">Refresh memory </w:t>
+            </w:r>
+            <w:r>
+              <w:rPr>
+                <w:rFonts w:cs="Arial"/>
+              </w:rPr>
+              <w:t>and remind them of important formulas, expressions, intuitions, and interpretations. Write important elements on the blackboard for later availability.</w:t>
+            </w:r>
+          </w:p>
+        </w:tc>
+        <w:tc>
+          <w:tcPr>
+            <w:tcW w:w="1701" w:type="dxa"/>
+            <w:tcBorders>
+              <w:top w:val="single" w:sz="4" w:space="0" w:color="ED7D31" w:themeColor="accent2"/>
+              <w:left w:val="single" w:sz="4" w:space="0" w:color="ED7D31" w:themeColor="accent2"/>
+              <w:bottom w:val="single" w:sz="4" w:space="0" w:color="ED7D31" w:themeColor="accent2"/>
+              <w:right w:val="single" w:sz="4" w:space="0" w:color="ED7D31" w:themeColor="accent2"/>
+            </w:tcBorders>
+            <w:shd w:val="clear" w:color="auto" w:fill="FFFFFF" w:themeFill="background1"/>
+          </w:tcPr>
+          <w:p>
+            <w:pPr>
+              <w:rPr>
+                <w:rFonts w:cs="Arial"/>
+              </w:rPr>
+            </w:pPr>
+            <w:r>
+              <w:rPr>
+                <w:rFonts w:cs="Arial"/>
+              </w:rPr>
+              <w:t>TA</w:t>
+            </w:r>
+          </w:p>
+        </w:tc>
+        <w:tc>
+          <w:tcPr>
+            <w:tcW w:w="3690" w:type="dxa"/>
+            <w:tcBorders>
+              <w:top w:val="single" w:sz="4" w:space="0" w:color="ED7D31" w:themeColor="accent2"/>
+              <w:left w:val="single" w:sz="4" w:space="0" w:color="ED7D31" w:themeColor="accent2"/>
+              <w:bottom w:val="single" w:sz="4" w:space="0" w:color="ED7D31" w:themeColor="accent2"/>
+            </w:tcBorders>
+            <w:shd w:val="clear" w:color="auto" w:fill="FFFFFF" w:themeFill="background1"/>
+          </w:tcPr>
+          <w:p>
+            <w:pPr>
+              <w:rPr>
+                <w:rFonts w:cs="Arial"/>
+              </w:rPr>
+            </w:pPr>
+            <w:r>
+              <w:rPr>
+                <w:rFonts w:cs="Arial"/>
+              </w:rPr>
+              <w:t>The studets are prepared on a more detailed level for today’s exercises. They are reminded of concepts they have been presented with before, hopefully making the knowledge readily available. The crux of certain tasks may be too difficult and hints can be writen on the blackboard to even out the difficulty.</w:t>
+            </w:r>
+          </w:p>
+        </w:tc>
+      </w:tr>
+      <w:tr>
+        <w:trPr>
+          <w:trHeight w:val="287"/>
+        </w:trPr>
+        <w:tc>
+          <w:tcPr>
+            <w:tcW w:w="990" w:type="dxa"/>
+            <w:tcBorders>
+              <w:top w:val="single" w:sz="4" w:space="0" w:color="ED7D31" w:themeColor="accent2"/>
+              <w:bottom w:val="single" w:sz="4" w:space="0" w:color="ED7D31" w:themeColor="accent2"/>
+              <w:right w:val="single" w:sz="4" w:space="0" w:color="ED7D31" w:themeColor="accent2"/>
+            </w:tcBorders>
+            <w:shd w:val="clear" w:color="auto" w:fill="FFFFFF" w:themeFill="background1"/>
+          </w:tcPr>
+          <w:p>
+            <w:pPr>
+              <w:rPr>
+                <w:rFonts w:cs="Arial"/>
+              </w:rPr>
+            </w:pPr>
+          </w:p>
+        </w:tc>
+        <w:tc>
+          <w:tcPr>
+            <w:tcW w:w="2691" w:type="dxa"/>
+            <w:tcBorders>
+              <w:top w:val="single" w:sz="4" w:space="0" w:color="ED7D31" w:themeColor="accent2"/>
+              <w:left w:val="single" w:sz="4" w:space="0" w:color="ED7D31" w:themeColor="accent2"/>
+              <w:bottom w:val="single" w:sz="4" w:space="0" w:color="ED7D31" w:themeColor="accent2"/>
+              <w:right w:val="single" w:sz="4" w:space="0" w:color="ED7D31" w:themeColor="accent2"/>
+            </w:tcBorders>
+            <w:shd w:val="clear" w:color="auto" w:fill="FFFFFF" w:themeFill="background1"/>
+          </w:tcPr>
+          <w:p>
+            <w:pPr>
+              <w:rPr>
+                <w:rFonts w:cs="Arial"/>
+              </w:rPr>
+            </w:pPr>
+            <w:r>
+              <w:rPr>
+                <w:rFonts w:cs="Arial"/>
+                <w:b/>
+                <w:bCs/>
+              </w:rPr>
+              <w:t>Think</w:t>
+            </w:r>
+            <w:r>
+              <w:rPr>
+                <w:rFonts w:cs="Arial"/>
+                <w:b/>
+                <w:bCs/>
+              </w:rPr>
+              <w:br/>
+            </w:r>
+            <w:r>
+              <w:rPr>
+                <w:rFonts w:cs="Arial"/>
+              </w:rPr>
+              <w:t>Each pair of pairs assign tasks to each pair (different tasks inside group of four).</w:t>
+            </w:r>
+            <w:r>
+              <w:rPr>
+                <w:rFonts w:cs="Arial"/>
+                <w:b/>
+                <w:bCs/>
+              </w:rPr>
+              <w:br/>
+            </w:r>
+            <w:r>
+              <w:rPr>
+                <w:rFonts w:cs="Arial"/>
+              </w:rPr>
+              <w:lastRenderedPageBreak/>
+              <w:t>Student</w:t>
+            </w:r>
+            <w:r>
+              <w:rPr>
+                <w:rFonts w:cs="Arial"/>
+              </w:rPr>
+              <w:t xml:space="preserve">s then </w:t>
+            </w:r>
+            <w:r>
+              <w:rPr>
+                <w:rFonts w:cs="Arial"/>
+              </w:rPr>
+              <w:t xml:space="preserve">spend time alone and in silence to form their own </w:t>
+            </w:r>
+            <w:r>
+              <w:rPr>
+                <w:rFonts w:cs="Arial"/>
+              </w:rPr>
+              <w:t>overview and ideas.</w:t>
+            </w:r>
+          </w:p>
+        </w:tc>
+        <w:tc>
+          <w:tcPr>
+            <w:tcW w:w="1701" w:type="dxa"/>
+            <w:tcBorders>
+              <w:top w:val="single" w:sz="4" w:space="0" w:color="ED7D31" w:themeColor="accent2"/>
+              <w:left w:val="single" w:sz="4" w:space="0" w:color="ED7D31" w:themeColor="accent2"/>
+              <w:bottom w:val="single" w:sz="4" w:space="0" w:color="ED7D31" w:themeColor="accent2"/>
+              <w:right w:val="single" w:sz="4" w:space="0" w:color="ED7D31" w:themeColor="accent2"/>
+            </w:tcBorders>
+            <w:shd w:val="clear" w:color="auto" w:fill="FFFFFF" w:themeFill="background1"/>
+          </w:tcPr>
+          <w:p>
+            <w:pPr>
+              <w:rPr>
+                <w:rFonts w:cs="Arial"/>
+              </w:rPr>
+            </w:pPr>
+            <w:r>
+              <w:rPr>
+                <w:rFonts w:cs="Arial"/>
+              </w:rPr>
+              <w:lastRenderedPageBreak/>
+              <w:t>Students</w:t>
+            </w:r>
+          </w:p>
+        </w:tc>
+        <w:tc>
+          <w:tcPr>
+            <w:tcW w:w="3690" w:type="dxa"/>
+            <w:tcBorders>
+              <w:top w:val="single" w:sz="4" w:space="0" w:color="ED7D31" w:themeColor="accent2"/>
+              <w:left w:val="single" w:sz="4" w:space="0" w:color="ED7D31" w:themeColor="accent2"/>
+              <w:bottom w:val="single" w:sz="4" w:space="0" w:color="ED7D31" w:themeColor="accent2"/>
+            </w:tcBorders>
+            <w:shd w:val="clear" w:color="auto" w:fill="FFFFFF" w:themeFill="background1"/>
+          </w:tcPr>
+          <w:p>
+            <w:pPr>
+              <w:rPr>
+                <w:rFonts w:cs="Arial"/>
+              </w:rPr>
+            </w:pPr>
+            <w:r>
+              <w:rPr>
+                <w:rFonts w:cs="Arial"/>
+              </w:rPr>
+              <w:t xml:space="preserve">Students get a change to understand the exercise </w:t>
+            </w:r>
+            <w:r>
+              <w:rPr>
+                <w:rFonts w:cs="Arial"/>
+              </w:rPr>
+              <w:t xml:space="preserve">and develop ideas </w:t>
+            </w:r>
+            <w:r>
+              <w:rPr>
+                <w:rFonts w:cs="Arial"/>
+              </w:rPr>
+              <w:t>in their own tempo</w:t>
+            </w:r>
+            <w:r>
+              <w:rPr>
+                <w:rFonts w:cs="Arial"/>
+              </w:rPr>
+              <w:t>.</w:t>
+            </w:r>
+          </w:p>
+        </w:tc>
+      </w:tr>
+      <w:tr>
+        <w:trPr>
+          <w:trHeight w:val="272"/>
+        </w:trPr>
+        <w:tc>
+          <w:tcPr>
+            <w:tcW w:w="990" w:type="dxa"/>
+            <w:tcBorders>
+              <w:top w:val="single" w:sz="4" w:space="0" w:color="ED7D31" w:themeColor="accent2"/>
+              <w:bottom w:val="single" w:sz="4" w:space="0" w:color="ED7D31" w:themeColor="accent2"/>
+              <w:right w:val="single" w:sz="4" w:space="0" w:color="ED7D31" w:themeColor="accent2"/>
+            </w:tcBorders>
+            <w:shd w:val="clear" w:color="auto" w:fill="FFFFFF" w:themeFill="background1"/>
+          </w:tcPr>
+          <w:p>
+            <w:pPr>
+              <w:rPr>
+                <w:rFonts w:cs="Arial"/>
+              </w:rPr>
+            </w:pPr>
+          </w:p>
+        </w:tc>
+        <w:tc>
+          <w:tcPr>
+            <w:tcW w:w="2691" w:type="dxa"/>
+            <w:tcBorders>
+              <w:top w:val="single" w:sz="4" w:space="0" w:color="ED7D31" w:themeColor="accent2"/>
+              <w:left w:val="single" w:sz="4" w:space="0" w:color="ED7D31" w:themeColor="accent2"/>
+              <w:bottom w:val="single" w:sz="4" w:space="0" w:color="ED7D31" w:themeColor="accent2"/>
+              <w:right w:val="single" w:sz="4" w:space="0" w:color="ED7D31" w:themeColor="accent2"/>
+            </w:tcBorders>
+            <w:shd w:val="clear" w:color="auto" w:fill="FFFFFF" w:themeFill="background1"/>
+          </w:tcPr>
+          <w:p>
+            <w:pPr>
+              <w:rPr>
+                <w:rFonts w:cs="Arial"/>
+              </w:rPr>
+            </w:pPr>
+            <w:r>
+              <w:rPr>
+                <w:rFonts w:cs="Arial"/>
+                <w:b/>
+                <w:bCs/>
+              </w:rPr>
+              <w:t>Pair</w:t>
+            </w:r>
+            <w:r>
+              <w:rPr>
+                <w:rFonts w:cs="Arial"/>
+                <w:b/>
+                <w:bCs/>
+              </w:rPr>
+              <w:br/>
+            </w:r>
+            <w:r>
+              <w:rPr>
+                <w:rFonts w:cs="Arial"/>
+              </w:rPr>
+              <w:t>Discuss and solve task with</w:t>
+            </w:r>
+            <w:r>
+              <w:rPr>
+                <w:rFonts w:cs="Arial"/>
+              </w:rPr>
+              <w:t xml:space="preserve"> assigned</w:t>
+            </w:r>
+            <w:r>
+              <w:rPr>
+                <w:rFonts w:cs="Arial"/>
+              </w:rPr>
+              <w:t xml:space="preserve"> partner</w:t>
+            </w:r>
+            <w:r>
+              <w:rPr>
+                <w:rFonts w:cs="Arial"/>
+              </w:rPr>
+              <w:t>.</w:t>
+            </w:r>
+            <w:r>
+              <w:rPr>
+                <w:rFonts w:cs="Arial"/>
+              </w:rPr>
+              <w:br/>
+              <w:t>The TA walks around, observes and listens, and gives hints, asks questions, and in general provide guidance as needed.</w:t>
+            </w:r>
+          </w:p>
+        </w:tc>
+        <w:tc>
+          <w:tcPr>
+            <w:tcW w:w="1701" w:type="dxa"/>
+            <w:tcBorders>
+              <w:top w:val="single" w:sz="4" w:space="0" w:color="ED7D31" w:themeColor="accent2"/>
+              <w:left w:val="single" w:sz="4" w:space="0" w:color="ED7D31" w:themeColor="accent2"/>
+              <w:bottom w:val="single" w:sz="4" w:space="0" w:color="ED7D31" w:themeColor="accent2"/>
+              <w:right w:val="single" w:sz="4" w:space="0" w:color="ED7D31" w:themeColor="accent2"/>
+            </w:tcBorders>
+            <w:shd w:val="clear" w:color="auto" w:fill="FFFFFF" w:themeFill="background1"/>
+          </w:tcPr>
+          <w:p>
+            <w:pPr>
+              <w:rPr>
+                <w:rFonts w:cs="Arial"/>
+              </w:rPr>
+            </w:pPr>
+            <w:r>
+              <w:rPr>
+                <w:rFonts w:cs="Arial"/>
+              </w:rPr>
+              <w:t>Students + TA</w:t>
+            </w:r>
+          </w:p>
+        </w:tc>
+        <w:tc>
+          <w:tcPr>
+            <w:tcW w:w="3690" w:type="dxa"/>
+            <w:tcBorders>
+              <w:top w:val="single" w:sz="4" w:space="0" w:color="ED7D31" w:themeColor="accent2"/>
+              <w:left w:val="single" w:sz="4" w:space="0" w:color="ED7D31" w:themeColor="accent2"/>
+              <w:bottom w:val="single" w:sz="4" w:space="0" w:color="ED7D31" w:themeColor="accent2"/>
+            </w:tcBorders>
+            <w:shd w:val="clear" w:color="auto" w:fill="FFFFFF" w:themeFill="background1"/>
+          </w:tcPr>
+          <w:p>
+            <w:pPr>
+              <w:rPr>
+                <w:rFonts w:cs="Arial"/>
+              </w:rPr>
+            </w:pPr>
+            <w:r>
+              <w:rPr>
+                <w:rFonts w:cs="Arial"/>
+              </w:rPr>
+              <w:t>Students discuss their ideas and approaches with each other</w:t>
+            </w:r>
+            <w:r>
+              <w:rPr>
+                <w:rFonts w:cs="Arial"/>
+              </w:rPr>
+              <w:t xml:space="preserve"> in an informal and relaxed environment</w:t>
+            </w:r>
+            <w:r>
+              <w:rPr>
+                <w:rFonts w:cs="Arial"/>
+              </w:rPr>
+              <w:t xml:space="preserve">. Conversation stimulates thoughts, the students are presented with new perspectives, they are accountable to each other, and they must </w:t>
+            </w:r>
+            <w:r>
+              <w:rPr>
+                <w:rFonts w:cs="Arial"/>
+              </w:rPr>
+              <w:t>make an effort to explain their ideas.</w:t>
+            </w:r>
+            <w:r>
+              <w:rPr>
+                <w:rFonts w:cs="Arial"/>
+              </w:rPr>
+              <w:t xml:space="preserve"> The students complement each other and must agree on a shared solution, making them learn from each other.</w:t>
+            </w:r>
+          </w:p>
+        </w:tc>
+      </w:tr>
+      <w:tr>
+        <w:trPr>
+          <w:trHeight w:val="287"/>
+        </w:trPr>
+        <w:tc>
+          <w:tcPr>
+            <w:tcW w:w="990" w:type="dxa"/>
+            <w:tcBorders>
+              <w:top w:val="single" w:sz="4" w:space="0" w:color="ED7D31" w:themeColor="accent2"/>
+              <w:bottom w:val="single" w:sz="4" w:space="0" w:color="ED7D31" w:themeColor="accent2"/>
+              <w:right w:val="single" w:sz="4" w:space="0" w:color="ED7D31" w:themeColor="accent2"/>
+            </w:tcBorders>
+            <w:shd w:val="clear" w:color="auto" w:fill="FFFFFF" w:themeFill="background1"/>
+          </w:tcPr>
+          <w:p>
+            <w:pPr>
+              <w:rPr>
+                <w:rFonts w:cs="Arial"/>
+              </w:rPr>
+            </w:pPr>
+          </w:p>
+        </w:tc>
+        <w:tc>
+          <w:tcPr>
+            <w:tcW w:w="2691" w:type="dxa"/>
+            <w:tcBorders>
+              <w:top w:val="single" w:sz="4" w:space="0" w:color="ED7D31" w:themeColor="accent2"/>
+              <w:left w:val="single" w:sz="4" w:space="0" w:color="ED7D31" w:themeColor="accent2"/>
+              <w:bottom w:val="single" w:sz="4" w:space="0" w:color="ED7D31" w:themeColor="accent2"/>
+              <w:right w:val="single" w:sz="4" w:space="0" w:color="ED7D31" w:themeColor="accent2"/>
+            </w:tcBorders>
+            <w:shd w:val="clear" w:color="auto" w:fill="FFFFFF" w:themeFill="background1"/>
+          </w:tcPr>
+          <w:p>
+            <w:pPr>
+              <w:rPr>
+                <w:rFonts w:cs="Arial"/>
+                <w:b/>
+                <w:bCs/>
+              </w:rPr>
+            </w:pPr>
+            <w:r>
+              <w:rPr>
+                <w:rFonts w:cs="Arial"/>
+                <w:b/>
+                <w:bCs/>
+              </w:rPr>
+              <w:t>Break</w:t>
+            </w:r>
+          </w:p>
+        </w:tc>
+        <w:tc>
+          <w:tcPr>
+            <w:tcW w:w="1701" w:type="dxa"/>
+            <w:tcBorders>
+              <w:top w:val="single" w:sz="4" w:space="0" w:color="ED7D31" w:themeColor="accent2"/>
+              <w:left w:val="single" w:sz="4" w:space="0" w:color="ED7D31" w:themeColor="accent2"/>
+              <w:bottom w:val="single" w:sz="4" w:space="0" w:color="ED7D31" w:themeColor="accent2"/>
+              <w:right w:val="single" w:sz="4" w:space="0" w:color="ED7D31" w:themeColor="accent2"/>
+            </w:tcBorders>
+            <w:shd w:val="clear" w:color="auto" w:fill="FFFFFF" w:themeFill="background1"/>
+          </w:tcPr>
+          <w:p>
+            <w:pPr>
+              <w:rPr>
+                <w:rFonts w:cs="Arial"/>
+              </w:rPr>
+            </w:pPr>
+            <w:r>
+              <w:rPr>
+                <w:rFonts w:cs="Arial"/>
+              </w:rPr>
+              <w:t>Students + TA</w:t>
+            </w:r>
+          </w:p>
+        </w:tc>
+        <w:tc>
+          <w:tcPr>
+            <w:tcW w:w="3690" w:type="dxa"/>
+            <w:tcBorders>
+              <w:top w:val="single" w:sz="4" w:space="0" w:color="ED7D31" w:themeColor="accent2"/>
+              <w:left w:val="single" w:sz="4" w:space="0" w:color="ED7D31" w:themeColor="accent2"/>
+              <w:bottom w:val="single" w:sz="4" w:space="0" w:color="ED7D31" w:themeColor="accent2"/>
+            </w:tcBorders>
+            <w:shd w:val="clear" w:color="auto" w:fill="FFFFFF" w:themeFill="background1"/>
+          </w:tcPr>
+          <w:p>
+            <w:pPr>
+              <w:rPr>
+                <w:rFonts w:cs="Arial"/>
+              </w:rPr>
+            </w:pPr>
+            <w:r>
+              <w:rPr>
+                <w:rFonts w:cs="Arial"/>
+              </w:rPr>
+              <w:t>Everyone needs a break sometimes.</w:t>
+            </w:r>
+          </w:p>
+        </w:tc>
+      </w:tr>
+      <w:tr>
+        <w:trPr>
+          <w:trHeight w:val="272"/>
+        </w:trPr>
+        <w:tc>
+          <w:tcPr>
+            <w:tcW w:w="990" w:type="dxa"/>
+            <w:tcBorders>
+              <w:top w:val="single" w:sz="4" w:space="0" w:color="ED7D31" w:themeColor="accent2"/>
+              <w:bottom w:val="single" w:sz="4" w:space="0" w:color="ED7D31" w:themeColor="accent2"/>
+              <w:right w:val="single" w:sz="4" w:space="0" w:color="ED7D31" w:themeColor="accent2"/>
+            </w:tcBorders>
+            <w:shd w:val="clear" w:color="auto" w:fill="FFFFFF" w:themeFill="background1"/>
+          </w:tcPr>
+          <w:p>
+            <w:pPr>
+              <w:rPr>
+                <w:rFonts w:cs="Arial"/>
+              </w:rPr>
+            </w:pPr>
+          </w:p>
+        </w:tc>
+        <w:tc>
+          <w:tcPr>
+            <w:tcW w:w="2691" w:type="dxa"/>
+            <w:tcBorders>
+              <w:top w:val="single" w:sz="4" w:space="0" w:color="ED7D31" w:themeColor="accent2"/>
+              <w:left w:val="single" w:sz="4" w:space="0" w:color="ED7D31" w:themeColor="accent2"/>
+              <w:bottom w:val="single" w:sz="4" w:space="0" w:color="ED7D31" w:themeColor="accent2"/>
+              <w:right w:val="single" w:sz="4" w:space="0" w:color="ED7D31" w:themeColor="accent2"/>
+            </w:tcBorders>
+            <w:shd w:val="clear" w:color="auto" w:fill="FFFFFF" w:themeFill="background1"/>
+          </w:tcPr>
+          <w:p>
+            <w:pPr>
+              <w:rPr>
+                <w:rFonts w:cs="Arial"/>
+              </w:rPr>
+            </w:pPr>
+            <w:r>
+              <w:rPr>
+                <w:rFonts w:cs="Arial"/>
+                <w:b/>
+                <w:bCs/>
+              </w:rPr>
+              <w:t>Share</w:t>
+            </w:r>
+            <w:r>
+              <w:rPr>
+                <w:rFonts w:cs="Arial"/>
+                <w:b/>
+                <w:bCs/>
+              </w:rPr>
+              <w:br/>
+            </w:r>
+            <w:r>
+              <w:rPr>
+                <w:rFonts w:cs="Arial"/>
+              </w:rPr>
+              <w:t xml:space="preserve">Each pair </w:t>
+            </w:r>
+            <w:r>
+              <w:rPr>
+                <w:rFonts w:cs="Arial"/>
+              </w:rPr>
+              <w:t xml:space="preserve">teams up </w:t>
+            </w:r>
+            <w:r>
+              <w:rPr>
+                <w:rFonts w:cs="Arial"/>
+              </w:rPr>
+              <w:t>with partner pair and present</w:t>
+            </w:r>
+            <w:r>
+              <w:rPr>
+                <w:rFonts w:cs="Arial"/>
+              </w:rPr>
+              <w:t>s</w:t>
+            </w:r>
+            <w:r>
+              <w:rPr>
+                <w:rFonts w:cs="Arial"/>
+              </w:rPr>
+              <w:t xml:space="preserve"> solution on blackboard to the other pair. Switch afterwards.</w:t>
+            </w:r>
+          </w:p>
+        </w:tc>
+        <w:tc>
+          <w:tcPr>
+            <w:tcW w:w="1701" w:type="dxa"/>
+            <w:tcBorders>
+              <w:top w:val="single" w:sz="4" w:space="0" w:color="ED7D31" w:themeColor="accent2"/>
+              <w:left w:val="single" w:sz="4" w:space="0" w:color="ED7D31" w:themeColor="accent2"/>
+              <w:bottom w:val="single" w:sz="4" w:space="0" w:color="ED7D31" w:themeColor="accent2"/>
+              <w:right w:val="single" w:sz="4" w:space="0" w:color="ED7D31" w:themeColor="accent2"/>
+            </w:tcBorders>
+            <w:shd w:val="clear" w:color="auto" w:fill="FFFFFF" w:themeFill="background1"/>
+          </w:tcPr>
+          <w:p>
+            <w:pPr>
+              <w:rPr>
+                <w:rFonts w:cs="Arial"/>
+              </w:rPr>
+            </w:pPr>
+            <w:r>
+              <w:rPr>
+                <w:rFonts w:cs="Arial"/>
+              </w:rPr>
+              <w:t>Students + TA</w:t>
+            </w:r>
+          </w:p>
+        </w:tc>
+        <w:tc>
+          <w:tcPr>
+            <w:tcW w:w="3690" w:type="dxa"/>
+            <w:tcBorders>
+              <w:top w:val="single" w:sz="4" w:space="0" w:color="ED7D31" w:themeColor="accent2"/>
+              <w:left w:val="single" w:sz="4" w:space="0" w:color="ED7D31" w:themeColor="accent2"/>
+              <w:bottom w:val="single" w:sz="4" w:space="0" w:color="ED7D31" w:themeColor="accent2"/>
+            </w:tcBorders>
+            <w:shd w:val="clear" w:color="auto" w:fill="FFFFFF" w:themeFill="background1"/>
+          </w:tcPr>
+          <w:p>
+            <w:pPr>
+              <w:rPr>
+                <w:rFonts w:cs="Arial"/>
+              </w:rPr>
+            </w:pPr>
+            <w:r>
+              <w:rPr>
+                <w:rFonts w:cs="Arial"/>
+              </w:rPr>
+              <w:t>Presenting solutions to another pair without the same preconceptions is challenging and requires the presenting pair to be detailed and clear. The pairs learn from the other’s mistakes and practice verbally communicating their arguements.</w:t>
+            </w:r>
+          </w:p>
+        </w:tc>
+      </w:tr>
+      <w:tr>
+        <w:trPr>
+          <w:trHeight w:val="272"/>
+        </w:trPr>
+        <w:tc>
+          <w:tcPr>
+            <w:tcW w:w="990" w:type="dxa"/>
+            <w:tcBorders>
+              <w:top w:val="single" w:sz="4" w:space="0" w:color="ED7D31" w:themeColor="accent2"/>
+              <w:bottom w:val="single" w:sz="4" w:space="0" w:color="ED7D31" w:themeColor="accent2"/>
+              <w:right w:val="single" w:sz="4" w:space="0" w:color="ED7D31" w:themeColor="accent2"/>
+            </w:tcBorders>
+            <w:shd w:val="clear" w:color="auto" w:fill="FFFFFF" w:themeFill="background1"/>
+          </w:tcPr>
+          <w:p>
+            <w:pPr>
+              <w:rPr>
+                <w:rFonts w:cs="Arial"/>
+              </w:rPr>
+            </w:pPr>
+          </w:p>
+        </w:tc>
+        <w:tc>
+          <w:tcPr>
+            <w:tcW w:w="2691" w:type="dxa"/>
+            <w:tcBorders>
+              <w:top w:val="single" w:sz="4" w:space="0" w:color="ED7D31" w:themeColor="accent2"/>
+              <w:left w:val="single" w:sz="4" w:space="0" w:color="ED7D31" w:themeColor="accent2"/>
+              <w:bottom w:val="single" w:sz="4" w:space="0" w:color="ED7D31" w:themeColor="accent2"/>
+              <w:right w:val="single" w:sz="4" w:space="0" w:color="ED7D31" w:themeColor="accent2"/>
+            </w:tcBorders>
+            <w:shd w:val="clear" w:color="auto" w:fill="FFFFFF" w:themeFill="background1"/>
+          </w:tcPr>
+          <w:p>
+            <w:pPr>
+              <w:rPr>
+                <w:rFonts w:cs="Arial"/>
+              </w:rPr>
+            </w:pPr>
+            <w:r>
+              <w:rPr>
+                <w:rFonts w:cs="Arial"/>
+                <w:b/>
+                <w:bCs/>
+              </w:rPr>
+              <w:t>Leftover time</w:t>
+            </w:r>
+            <w:r>
+              <w:rPr>
+                <w:rFonts w:cs="Arial"/>
+                <w:b/>
+                <w:bCs/>
+              </w:rPr>
+              <w:br/>
+            </w:r>
+            <w:r>
+              <w:rPr>
+                <w:rFonts w:cs="Arial"/>
+              </w:rPr>
+              <w:t xml:space="preserve">Solve remaining exercises alone or together or work on programming exercises. </w:t>
+            </w:r>
+          </w:p>
+        </w:tc>
+        <w:tc>
+          <w:tcPr>
+            <w:tcW w:w="1701" w:type="dxa"/>
+            <w:tcBorders>
+              <w:top w:val="single" w:sz="4" w:space="0" w:color="ED7D31" w:themeColor="accent2"/>
+              <w:left w:val="single" w:sz="4" w:space="0" w:color="ED7D31" w:themeColor="accent2"/>
+              <w:bottom w:val="single" w:sz="4" w:space="0" w:color="ED7D31" w:themeColor="accent2"/>
+              <w:right w:val="single" w:sz="4" w:space="0" w:color="ED7D31" w:themeColor="accent2"/>
+            </w:tcBorders>
+            <w:shd w:val="clear" w:color="auto" w:fill="FFFFFF" w:themeFill="background1"/>
+          </w:tcPr>
+          <w:p>
+            <w:pPr>
+              <w:rPr>
+                <w:rFonts w:cs="Arial"/>
+              </w:rPr>
+            </w:pPr>
+            <w:r>
+              <w:rPr>
+                <w:rFonts w:cs="Arial"/>
+              </w:rPr>
+              <w:t>Students + TA</w:t>
+            </w:r>
+          </w:p>
+        </w:tc>
+        <w:tc>
+          <w:tcPr>
+            <w:tcW w:w="3690" w:type="dxa"/>
+            <w:tcBorders>
+              <w:top w:val="single" w:sz="4" w:space="0" w:color="ED7D31" w:themeColor="accent2"/>
+              <w:left w:val="single" w:sz="4" w:space="0" w:color="ED7D31" w:themeColor="accent2"/>
+              <w:bottom w:val="single" w:sz="4" w:space="0" w:color="ED7D31" w:themeColor="accent2"/>
+            </w:tcBorders>
+            <w:shd w:val="clear" w:color="auto" w:fill="FFFFFF" w:themeFill="background1"/>
+          </w:tcPr>
+          <w:p>
+            <w:pPr>
+              <w:rPr>
+                <w:rFonts w:cs="Arial"/>
+              </w:rPr>
+            </w:pPr>
+            <w:r>
+              <w:rPr>
+                <w:rFonts w:cs="Arial"/>
+              </w:rPr>
+              <w:t>Students are given free reign to practice what they deem valuable.</w:t>
+            </w:r>
+          </w:p>
+        </w:tc>
+      </w:tr>
+      <w:tr>
+        <w:trPr>
+          <w:trHeight w:val="287"/>
+        </w:trPr>
+        <w:tc>
+          <w:tcPr>
+            <w:tcW w:w="990" w:type="dxa"/>
+            <w:tcBorders>
+              <w:top w:val="single" w:sz="4" w:space="0" w:color="ED7D31" w:themeColor="accent2"/>
+              <w:bottom w:val="single" w:sz="4" w:space="0" w:color="ED7D31" w:themeColor="accent2"/>
+              <w:right w:val="single" w:sz="4" w:space="0" w:color="ED7D31" w:themeColor="accent2"/>
+            </w:tcBorders>
+            <w:shd w:val="clear" w:color="auto" w:fill="FFFFFF" w:themeFill="background1"/>
+          </w:tcPr>
+          <w:p>
+            <w:pPr>
+              <w:rPr>
+                <w:rFonts w:cs="Arial"/>
+              </w:rPr>
+            </w:pPr>
+          </w:p>
+        </w:tc>
+        <w:tc>
+          <w:tcPr>
+            <w:tcW w:w="2691" w:type="dxa"/>
+            <w:tcBorders>
+              <w:top w:val="single" w:sz="4" w:space="0" w:color="ED7D31" w:themeColor="accent2"/>
+              <w:left w:val="single" w:sz="4" w:space="0" w:color="ED7D31" w:themeColor="accent2"/>
+              <w:bottom w:val="single" w:sz="4" w:space="0" w:color="ED7D31" w:themeColor="accent2"/>
+              <w:right w:val="single" w:sz="4" w:space="0" w:color="ED7D31" w:themeColor="accent2"/>
+            </w:tcBorders>
+            <w:shd w:val="clear" w:color="auto" w:fill="FFFFFF" w:themeFill="background1"/>
+          </w:tcPr>
+          <w:p>
+            <w:pPr>
+              <w:rPr>
+                <w:rFonts w:cs="Arial"/>
+              </w:rPr>
+            </w:pPr>
+          </w:p>
+        </w:tc>
+        <w:tc>
+          <w:tcPr>
+            <w:tcW w:w="1701" w:type="dxa"/>
+            <w:tcBorders>
+              <w:top w:val="single" w:sz="4" w:space="0" w:color="ED7D31" w:themeColor="accent2"/>
+              <w:left w:val="single" w:sz="4" w:space="0" w:color="ED7D31" w:themeColor="accent2"/>
+              <w:bottom w:val="single" w:sz="4" w:space="0" w:color="ED7D31" w:themeColor="accent2"/>
+              <w:right w:val="single" w:sz="4" w:space="0" w:color="ED7D31" w:themeColor="accent2"/>
+            </w:tcBorders>
+            <w:shd w:val="clear" w:color="auto" w:fill="FFFFFF" w:themeFill="background1"/>
+          </w:tcPr>
+          <w:p>
+            <w:pPr>
+              <w:rPr>
+                <w:rFonts w:cs="Arial"/>
+              </w:rPr>
+            </w:pPr>
+          </w:p>
+        </w:tc>
+        <w:tc>
+          <w:tcPr>
+            <w:tcW w:w="3690" w:type="dxa"/>
+            <w:tcBorders>
+              <w:top w:val="single" w:sz="4" w:space="0" w:color="ED7D31" w:themeColor="accent2"/>
+              <w:left w:val="single" w:sz="4" w:space="0" w:color="ED7D31" w:themeColor="accent2"/>
+              <w:bottom w:val="single" w:sz="4" w:space="0" w:color="ED7D31" w:themeColor="accent2"/>
+            </w:tcBorders>
+            <w:shd w:val="clear" w:color="auto" w:fill="FFFFFF" w:themeFill="background1"/>
+          </w:tcPr>
+          <w:p>
+            <w:pPr>
+              <w:rPr>
+                <w:rFonts w:cs="Arial"/>
+              </w:rPr>
+            </w:pPr>
+          </w:p>
+        </w:tc>
+      </w:tr>
+      <w:tr>
+        <w:trPr>
+          <w:trHeight w:val="272"/>
+        </w:trPr>
+        <w:tc>
+          <w:tcPr>
+            <w:tcW w:w="990" w:type="dxa"/>
+            <w:tcBorders>
+              <w:top w:val="single" w:sz="4" w:space="0" w:color="ED7D31" w:themeColor="accent2"/>
+              <w:bottom w:val="single" w:sz="4" w:space="0" w:color="ED7D31" w:themeColor="accent2"/>
+              <w:right w:val="single" w:sz="4" w:space="0" w:color="ED7D31" w:themeColor="accent2"/>
+            </w:tcBorders>
+            <w:shd w:val="clear" w:color="auto" w:fill="FFFFFF" w:themeFill="background1"/>
+          </w:tcPr>
+          <w:p>
+            <w:pPr>
+              <w:rPr>
+                <w:rFonts w:cs="Arial"/>
+              </w:rPr>
+            </w:pPr>
+          </w:p>
+        </w:tc>
+        <w:tc>
+          <w:tcPr>
+            <w:tcW w:w="2691" w:type="dxa"/>
+            <w:tcBorders>
+              <w:top w:val="single" w:sz="4" w:space="0" w:color="ED7D31" w:themeColor="accent2"/>
+              <w:left w:val="single" w:sz="4" w:space="0" w:color="ED7D31" w:themeColor="accent2"/>
+              <w:bottom w:val="single" w:sz="4" w:space="0" w:color="ED7D31" w:themeColor="accent2"/>
+              <w:right w:val="single" w:sz="4" w:space="0" w:color="ED7D31" w:themeColor="accent2"/>
+            </w:tcBorders>
+            <w:shd w:val="clear" w:color="auto" w:fill="FFFFFF" w:themeFill="background1"/>
+          </w:tcPr>
+          <w:p>
+            <w:pPr>
+              <w:rPr>
+                <w:rFonts w:cs="Arial"/>
+              </w:rPr>
+            </w:pPr>
+          </w:p>
+        </w:tc>
+        <w:tc>
+          <w:tcPr>
+            <w:tcW w:w="1701" w:type="dxa"/>
+            <w:tcBorders>
+              <w:top w:val="single" w:sz="4" w:space="0" w:color="ED7D31" w:themeColor="accent2"/>
+              <w:left w:val="single" w:sz="4" w:space="0" w:color="ED7D31" w:themeColor="accent2"/>
+              <w:bottom w:val="single" w:sz="4" w:space="0" w:color="ED7D31" w:themeColor="accent2"/>
+              <w:right w:val="single" w:sz="4" w:space="0" w:color="ED7D31" w:themeColor="accent2"/>
+            </w:tcBorders>
+            <w:shd w:val="clear" w:color="auto" w:fill="FFFFFF" w:themeFill="background1"/>
+          </w:tcPr>
+          <w:p>
+            <w:pPr>
+              <w:rPr>
+                <w:rFonts w:cs="Arial"/>
+              </w:rPr>
+            </w:pPr>
+          </w:p>
+        </w:tc>
+        <w:tc>
+          <w:tcPr>
+            <w:tcW w:w="3690" w:type="dxa"/>
+            <w:tcBorders>
+              <w:top w:val="single" w:sz="4" w:space="0" w:color="ED7D31" w:themeColor="accent2"/>
+              <w:left w:val="single" w:sz="4" w:space="0" w:color="ED7D31" w:themeColor="accent2"/>
+              <w:bottom w:val="single" w:sz="4" w:space="0" w:color="ED7D31" w:themeColor="accent2"/>
+            </w:tcBorders>
+            <w:shd w:val="clear" w:color="auto" w:fill="FFFFFF" w:themeFill="background1"/>
+          </w:tcPr>
+          <w:p>
+            <w:pPr>
+              <w:rPr>
+                <w:rFonts w:cs="Arial"/>
+              </w:rPr>
+            </w:pPr>
+          </w:p>
+        </w:tc>
+      </w:tr>
+      <w:tr>
+        <w:trPr>
+          <w:trHeight w:val="287"/>
+        </w:trPr>
+        <w:tc>
+          <w:tcPr>
+            <w:tcW w:w="990" w:type="dxa"/>
+            <w:tcBorders>
+              <w:top w:val="single" w:sz="4" w:space="0" w:color="ED7D31" w:themeColor="accent2"/>
+              <w:bottom w:val="single" w:sz="4" w:space="0" w:color="ED7D31" w:themeColor="accent2"/>
+              <w:right w:val="single" w:sz="4" w:space="0" w:color="ED7D31" w:themeColor="accent2"/>
+            </w:tcBorders>
+            <w:shd w:val="clear" w:color="auto" w:fill="FFFFFF" w:themeFill="background1"/>
+          </w:tcPr>
+          <w:p>
+            <w:pPr>
+              <w:rPr>
+                <w:rFonts w:cs="Arial"/>
+              </w:rPr>
+            </w:pPr>
+          </w:p>
+        </w:tc>
+        <w:tc>
+          <w:tcPr>
+            <w:tcW w:w="2691" w:type="dxa"/>
+            <w:tcBorders>
+              <w:top w:val="single" w:sz="4" w:space="0" w:color="ED7D31" w:themeColor="accent2"/>
+              <w:left w:val="single" w:sz="4" w:space="0" w:color="ED7D31" w:themeColor="accent2"/>
+              <w:bottom w:val="single" w:sz="4" w:space="0" w:color="ED7D31" w:themeColor="accent2"/>
+              <w:right w:val="single" w:sz="4" w:space="0" w:color="ED7D31" w:themeColor="accent2"/>
+            </w:tcBorders>
+            <w:shd w:val="clear" w:color="auto" w:fill="FFFFFF" w:themeFill="background1"/>
+          </w:tcPr>
+          <w:p>
+            <w:pPr>
+              <w:rPr>
+                <w:rFonts w:cs="Arial"/>
+              </w:rPr>
+            </w:pPr>
+          </w:p>
+        </w:tc>
+        <w:tc>
+          <w:tcPr>
+            <w:tcW w:w="1701" w:type="dxa"/>
+            <w:tcBorders>
+              <w:top w:val="single" w:sz="4" w:space="0" w:color="ED7D31" w:themeColor="accent2"/>
+              <w:left w:val="single" w:sz="4" w:space="0" w:color="ED7D31" w:themeColor="accent2"/>
+              <w:bottom w:val="single" w:sz="4" w:space="0" w:color="ED7D31" w:themeColor="accent2"/>
+              <w:right w:val="single" w:sz="4" w:space="0" w:color="ED7D31" w:themeColor="accent2"/>
+            </w:tcBorders>
+            <w:shd w:val="clear" w:color="auto" w:fill="FFFFFF" w:themeFill="background1"/>
+          </w:tcPr>
+          <w:p>
+            <w:pPr>
+              <w:rPr>
+                <w:rFonts w:cs="Arial"/>
+              </w:rPr>
+            </w:pPr>
+          </w:p>
+        </w:tc>
+        <w:tc>
+          <w:tcPr>
+            <w:tcW w:w="3690" w:type="dxa"/>
+            <w:tcBorders>
+              <w:top w:val="single" w:sz="4" w:space="0" w:color="ED7D31" w:themeColor="accent2"/>
+              <w:left w:val="single" w:sz="4" w:space="0" w:color="ED7D31" w:themeColor="accent2"/>
+              <w:bottom w:val="single" w:sz="4" w:space="0" w:color="ED7D31" w:themeColor="accent2"/>
+            </w:tcBorders>
+            <w:shd w:val="clear" w:color="auto" w:fill="FFFFFF" w:themeFill="background1"/>
+          </w:tcPr>
+          <w:p>
+            <w:pPr>
+              <w:rPr>
+                <w:rFonts w:cs="Arial"/>
+              </w:rPr>
+            </w:pPr>
+          </w:p>
+        </w:tc>
+      </w:tr>
+      <w:tr>
+        <w:trPr>
+          <w:trHeight w:val="272"/>
+        </w:trPr>
+        <w:tc>
+          <w:tcPr>
+            <w:tcW w:w="990" w:type="dxa"/>
+            <w:tcBorders>
+              <w:top w:val="single" w:sz="4" w:space="0" w:color="ED7D31" w:themeColor="accent2"/>
+              <w:bottom w:val="single" w:sz="4" w:space="0" w:color="ED7D31" w:themeColor="accent2"/>
+              <w:right w:val="single" w:sz="4" w:space="0" w:color="ED7D31" w:themeColor="accent2"/>
+            </w:tcBorders>
+            <w:shd w:val="clear" w:color="auto" w:fill="FFFFFF" w:themeFill="background1"/>
+          </w:tcPr>
+          <w:p>
+            <w:pPr>
+              <w:rPr>
+                <w:rFonts w:cs="Arial"/>
+              </w:rPr>
+            </w:pPr>
+          </w:p>
+        </w:tc>
+        <w:tc>
+          <w:tcPr>
+            <w:tcW w:w="2691" w:type="dxa"/>
+            <w:tcBorders>
+              <w:top w:val="single" w:sz="4" w:space="0" w:color="ED7D31" w:themeColor="accent2"/>
+              <w:left w:val="single" w:sz="4" w:space="0" w:color="ED7D31" w:themeColor="accent2"/>
+              <w:bottom w:val="single" w:sz="4" w:space="0" w:color="ED7D31" w:themeColor="accent2"/>
+              <w:right w:val="single" w:sz="4" w:space="0" w:color="ED7D31" w:themeColor="accent2"/>
+            </w:tcBorders>
+            <w:shd w:val="clear" w:color="auto" w:fill="FFFFFF" w:themeFill="background1"/>
+          </w:tcPr>
+          <w:p>
+            <w:pPr>
+              <w:rPr>
+                <w:rFonts w:cs="Arial"/>
+              </w:rPr>
+            </w:pPr>
+          </w:p>
+        </w:tc>
+        <w:tc>
+          <w:tcPr>
+            <w:tcW w:w="1701" w:type="dxa"/>
+            <w:tcBorders>
+              <w:top w:val="single" w:sz="4" w:space="0" w:color="ED7D31" w:themeColor="accent2"/>
+              <w:left w:val="single" w:sz="4" w:space="0" w:color="ED7D31" w:themeColor="accent2"/>
+              <w:bottom w:val="single" w:sz="4" w:space="0" w:color="ED7D31" w:themeColor="accent2"/>
+              <w:right w:val="single" w:sz="4" w:space="0" w:color="ED7D31" w:themeColor="accent2"/>
+            </w:tcBorders>
+            <w:shd w:val="clear" w:color="auto" w:fill="FFFFFF" w:themeFill="background1"/>
+          </w:tcPr>
+          <w:p>
+            <w:pPr>
+              <w:rPr>
+                <w:rFonts w:cs="Arial"/>
+              </w:rPr>
+            </w:pPr>
+          </w:p>
+        </w:tc>
+        <w:tc>
+          <w:tcPr>
+            <w:tcW w:w="3690" w:type="dxa"/>
+            <w:tcBorders>
+              <w:top w:val="single" w:sz="4" w:space="0" w:color="ED7D31" w:themeColor="accent2"/>
+              <w:left w:val="single" w:sz="4" w:space="0" w:color="ED7D31" w:themeColor="accent2"/>
+              <w:bottom w:val="single" w:sz="4" w:space="0" w:color="ED7D31" w:themeColor="accent2"/>
+            </w:tcBorders>
+            <w:shd w:val="clear" w:color="auto" w:fill="FFFFFF" w:themeFill="background1"/>
+          </w:tcPr>
+          <w:p>
+            <w:pPr>
+              <w:rPr>
+                <w:rFonts w:cs="Arial"/>
+              </w:rPr>
+            </w:pPr>
+          </w:p>
+        </w:tc>
+      </w:tr>
+      <w:tr>
+        <w:trPr>
+          <w:trHeight w:val="272"/>
+        </w:trPr>
+        <w:tc>
+          <w:tcPr>
+            <w:tcW w:w="990" w:type="dxa"/>
+            <w:tcBorders>
+              <w:top w:val="single" w:sz="4" w:space="0" w:color="ED7D31" w:themeColor="accent2"/>
+              <w:bottom w:val="single" w:sz="4" w:space="0" w:color="ED7D31" w:themeColor="accent2"/>
+              <w:right w:val="single" w:sz="4" w:space="0" w:color="ED7D31" w:themeColor="accent2"/>
+            </w:tcBorders>
+            <w:shd w:val="clear" w:color="auto" w:fill="FFFFFF" w:themeFill="background1"/>
+          </w:tcPr>
+          <w:p>
+            <w:pPr>
+              <w:rPr>
+                <w:rFonts w:cs="Arial"/>
+              </w:rPr>
+            </w:pPr>
+          </w:p>
+        </w:tc>
+        <w:tc>
+          <w:tcPr>
+            <w:tcW w:w="2691" w:type="dxa"/>
+            <w:tcBorders>
+              <w:top w:val="single" w:sz="4" w:space="0" w:color="ED7D31" w:themeColor="accent2"/>
+              <w:left w:val="single" w:sz="4" w:space="0" w:color="ED7D31" w:themeColor="accent2"/>
+              <w:bottom w:val="single" w:sz="4" w:space="0" w:color="ED7D31" w:themeColor="accent2"/>
+              <w:right w:val="single" w:sz="4" w:space="0" w:color="ED7D31" w:themeColor="accent2"/>
+            </w:tcBorders>
+            <w:shd w:val="clear" w:color="auto" w:fill="FFFFFF" w:themeFill="background1"/>
+          </w:tcPr>
+          <w:p>
+            <w:pPr>
+              <w:rPr>
+                <w:rFonts w:cs="Arial"/>
+              </w:rPr>
+            </w:pPr>
+          </w:p>
+        </w:tc>
+        <w:tc>
+          <w:tcPr>
+            <w:tcW w:w="1701" w:type="dxa"/>
+            <w:tcBorders>
+              <w:top w:val="single" w:sz="4" w:space="0" w:color="ED7D31" w:themeColor="accent2"/>
+              <w:left w:val="single" w:sz="4" w:space="0" w:color="ED7D31" w:themeColor="accent2"/>
+              <w:bottom w:val="single" w:sz="4" w:space="0" w:color="ED7D31" w:themeColor="accent2"/>
+              <w:right w:val="single" w:sz="4" w:space="0" w:color="ED7D31" w:themeColor="accent2"/>
+            </w:tcBorders>
+            <w:shd w:val="clear" w:color="auto" w:fill="FFFFFF" w:themeFill="background1"/>
+          </w:tcPr>
+          <w:p>
+            <w:pPr>
+              <w:rPr>
+                <w:rFonts w:cs="Arial"/>
+              </w:rPr>
+            </w:pPr>
+          </w:p>
+        </w:tc>
+        <w:tc>
+          <w:tcPr>
+            <w:tcW w:w="3690" w:type="dxa"/>
+            <w:tcBorders>
+              <w:top w:val="single" w:sz="4" w:space="0" w:color="ED7D31" w:themeColor="accent2"/>
+              <w:left w:val="single" w:sz="4" w:space="0" w:color="ED7D31" w:themeColor="accent2"/>
+              <w:bottom w:val="single" w:sz="4" w:space="0" w:color="ED7D31" w:themeColor="accent2"/>
+            </w:tcBorders>
+            <w:shd w:val="clear" w:color="auto" w:fill="FFFFFF" w:themeFill="background1"/>
+          </w:tcPr>
+          <w:p>
+            <w:pPr>
+              <w:rPr>
+                <w:rFonts w:cs="Arial"/>
+              </w:rPr>
+            </w:pPr>
+          </w:p>
+        </w:tc>
+      </w:tr>
+      <w:tr>
+        <w:trPr>
+          <w:trHeight w:val="287"/>
+        </w:trPr>
+        <w:tc>
+          <w:tcPr>
+            <w:tcW w:w="990" w:type="dxa"/>
+            <w:tcBorders>
+              <w:top w:val="single" w:sz="4" w:space="0" w:color="ED7D31" w:themeColor="accent2"/>
+              <w:bottom w:val="single" w:sz="4" w:space="0" w:color="ED7D31" w:themeColor="accent2"/>
+              <w:right w:val="single" w:sz="4" w:space="0" w:color="ED7D31" w:themeColor="accent2"/>
+            </w:tcBorders>
+            <w:shd w:val="clear" w:color="auto" w:fill="FFFFFF" w:themeFill="background1"/>
+          </w:tcPr>
+          <w:p>
+            <w:pPr>
+              <w:rPr>
+                <w:rFonts w:cs="Arial"/>
+              </w:rPr>
+            </w:pPr>
+          </w:p>
+        </w:tc>
+        <w:tc>
+          <w:tcPr>
+            <w:tcW w:w="2691" w:type="dxa"/>
+            <w:tcBorders>
+              <w:top w:val="single" w:sz="4" w:space="0" w:color="ED7D31" w:themeColor="accent2"/>
+              <w:left w:val="single" w:sz="4" w:space="0" w:color="ED7D31" w:themeColor="accent2"/>
+              <w:bottom w:val="single" w:sz="4" w:space="0" w:color="ED7D31" w:themeColor="accent2"/>
+              <w:right w:val="single" w:sz="4" w:space="0" w:color="ED7D31" w:themeColor="accent2"/>
+            </w:tcBorders>
+            <w:shd w:val="clear" w:color="auto" w:fill="FFFFFF" w:themeFill="background1"/>
+          </w:tcPr>
+          <w:p>
+            <w:pPr>
+              <w:rPr>
+                <w:rFonts w:cs="Arial"/>
+              </w:rPr>
+            </w:pPr>
+          </w:p>
+        </w:tc>
+        <w:tc>
+          <w:tcPr>
+            <w:tcW w:w="1701" w:type="dxa"/>
+            <w:tcBorders>
+              <w:top w:val="single" w:sz="4" w:space="0" w:color="ED7D31" w:themeColor="accent2"/>
+              <w:left w:val="single" w:sz="4" w:space="0" w:color="ED7D31" w:themeColor="accent2"/>
+              <w:bottom w:val="single" w:sz="4" w:space="0" w:color="ED7D31" w:themeColor="accent2"/>
+              <w:right w:val="single" w:sz="4" w:space="0" w:color="ED7D31" w:themeColor="accent2"/>
+            </w:tcBorders>
+            <w:shd w:val="clear" w:color="auto" w:fill="FFFFFF" w:themeFill="background1"/>
+          </w:tcPr>
+          <w:p>
+            <w:pPr>
+              <w:rPr>
+                <w:rFonts w:cs="Arial"/>
+              </w:rPr>
+            </w:pPr>
+          </w:p>
+        </w:tc>
+        <w:tc>
+          <w:tcPr>
+            <w:tcW w:w="3690" w:type="dxa"/>
+            <w:tcBorders>
+              <w:top w:val="single" w:sz="4" w:space="0" w:color="ED7D31" w:themeColor="accent2"/>
+              <w:left w:val="single" w:sz="4" w:space="0" w:color="ED7D31" w:themeColor="accent2"/>
+              <w:bottom w:val="single" w:sz="4" w:space="0" w:color="ED7D31" w:themeColor="accent2"/>
+            </w:tcBorders>
+            <w:shd w:val="clear" w:color="auto" w:fill="FFFFFF" w:themeFill="background1"/>
+          </w:tcPr>
+          <w:p>
+            <w:pPr>
+              <w:rPr>
+                <w:rFonts w:cs="Arial"/>
+              </w:rPr>
+            </w:pPr>
+          </w:p>
+        </w:tc>
+      </w:tr>
+      <w:tr>
+        <w:trPr>
+          <w:trHeight w:val="272"/>
+        </w:trPr>
+        <w:tc>
+          <w:tcPr>
+            <w:tcW w:w="990" w:type="dxa"/>
+            <w:tcBorders>
+              <w:top w:val="single" w:sz="4" w:space="0" w:color="ED7D31" w:themeColor="accent2"/>
+              <w:bottom w:val="single" w:sz="4" w:space="0" w:color="ED7D31" w:themeColor="accent2"/>
+              <w:right w:val="single" w:sz="4" w:space="0" w:color="ED7D31" w:themeColor="accent2"/>
+            </w:tcBorders>
+            <w:shd w:val="clear" w:color="auto" w:fill="FFFFFF" w:themeFill="background1"/>
+          </w:tcPr>
+          <w:p>
+            <w:pPr>
+              <w:rPr>
+                <w:rFonts w:cs="Arial"/>
+              </w:rPr>
+            </w:pPr>
+          </w:p>
+        </w:tc>
+        <w:tc>
+          <w:tcPr>
+            <w:tcW w:w="2691" w:type="dxa"/>
+            <w:tcBorders>
+              <w:top w:val="single" w:sz="4" w:space="0" w:color="ED7D31" w:themeColor="accent2"/>
+              <w:left w:val="single" w:sz="4" w:space="0" w:color="ED7D31" w:themeColor="accent2"/>
+              <w:bottom w:val="single" w:sz="4" w:space="0" w:color="ED7D31" w:themeColor="accent2"/>
+              <w:right w:val="single" w:sz="4" w:space="0" w:color="ED7D31" w:themeColor="accent2"/>
+            </w:tcBorders>
+            <w:shd w:val="clear" w:color="auto" w:fill="FFFFFF" w:themeFill="background1"/>
+          </w:tcPr>
+          <w:p>
+            <w:pPr>
+              <w:rPr>
+                <w:rFonts w:cs="Arial"/>
+              </w:rPr>
+            </w:pPr>
+          </w:p>
+        </w:tc>
+        <w:tc>
+          <w:tcPr>
+            <w:tcW w:w="1701" w:type="dxa"/>
+            <w:tcBorders>
+              <w:top w:val="single" w:sz="4" w:space="0" w:color="ED7D31" w:themeColor="accent2"/>
+              <w:left w:val="single" w:sz="4" w:space="0" w:color="ED7D31" w:themeColor="accent2"/>
+              <w:bottom w:val="single" w:sz="4" w:space="0" w:color="ED7D31" w:themeColor="accent2"/>
+              <w:right w:val="single" w:sz="4" w:space="0" w:color="ED7D31" w:themeColor="accent2"/>
+            </w:tcBorders>
+            <w:shd w:val="clear" w:color="auto" w:fill="FFFFFF" w:themeFill="background1"/>
+          </w:tcPr>
+          <w:p>
+            <w:pPr>
+              <w:rPr>
+                <w:rFonts w:cs="Arial"/>
+              </w:rPr>
+            </w:pPr>
+          </w:p>
+        </w:tc>
+        <w:tc>
+          <w:tcPr>
+            <w:tcW w:w="3690" w:type="dxa"/>
+            <w:tcBorders>
+              <w:top w:val="single" w:sz="4" w:space="0" w:color="ED7D31" w:themeColor="accent2"/>
+              <w:left w:val="single" w:sz="4" w:space="0" w:color="ED7D31" w:themeColor="accent2"/>
+              <w:bottom w:val="single" w:sz="4" w:space="0" w:color="ED7D31" w:themeColor="accent2"/>
+            </w:tcBorders>
+            <w:shd w:val="clear" w:color="auto" w:fill="FFFFFF" w:themeFill="background1"/>
+          </w:tcPr>
+          <w:p>
+            <w:pPr>
+              <w:rPr>
+                <w:rFonts w:cs="Arial"/>
+              </w:rPr>
+            </w:pPr>
+          </w:p>
+        </w:tc>
+      </w:tr>
+      <w:tr>
+        <w:trPr>
+          <w:trHeight w:val="287"/>
+        </w:trPr>
+        <w:tc>
+          <w:tcPr>
+            <w:tcW w:w="990" w:type="dxa"/>
+            <w:tcBorders>
+              <w:top w:val="single" w:sz="4" w:space="0" w:color="ED7D31" w:themeColor="accent2"/>
+              <w:right w:val="single" w:sz="4" w:space="0" w:color="ED7D31" w:themeColor="accent2"/>
+            </w:tcBorders>
+            <w:shd w:val="clear" w:color="auto" w:fill="FFFFFF" w:themeFill="background1"/>
+          </w:tcPr>
+          <w:p>
+            <w:pPr>
+              <w:rPr>
+                <w:rFonts w:cs="Arial"/>
+              </w:rPr>
+            </w:pPr>
+          </w:p>
+        </w:tc>
+        <w:tc>
+          <w:tcPr>
+            <w:tcW w:w="2691" w:type="dxa"/>
+            <w:tcBorders>
+              <w:top w:val="single" w:sz="4" w:space="0" w:color="ED7D31" w:themeColor="accent2"/>
+              <w:left w:val="single" w:sz="4" w:space="0" w:color="ED7D31" w:themeColor="accent2"/>
+              <w:right w:val="single" w:sz="4" w:space="0" w:color="ED7D31" w:themeColor="accent2"/>
+            </w:tcBorders>
+            <w:shd w:val="clear" w:color="auto" w:fill="FFFFFF" w:themeFill="background1"/>
+          </w:tcPr>
+          <w:p>
+            <w:pPr>
+              <w:rPr>
+                <w:rFonts w:cs="Arial"/>
+              </w:rPr>
+            </w:pPr>
+          </w:p>
+        </w:tc>
+        <w:tc>
+          <w:tcPr>
+            <w:tcW w:w="1701" w:type="dxa"/>
+            <w:tcBorders>
+              <w:top w:val="single" w:sz="4" w:space="0" w:color="ED7D31" w:themeColor="accent2"/>
+              <w:left w:val="single" w:sz="4" w:space="0" w:color="ED7D31" w:themeColor="accent2"/>
+              <w:right w:val="single" w:sz="4" w:space="0" w:color="ED7D31" w:themeColor="accent2"/>
+            </w:tcBorders>
+            <w:shd w:val="clear" w:color="auto" w:fill="FFFFFF" w:themeFill="background1"/>
+          </w:tcPr>
+          <w:p>
+            <w:pPr>
+              <w:rPr>
+                <w:rFonts w:cs="Arial"/>
+              </w:rPr>
+            </w:pPr>
+          </w:p>
+        </w:tc>
+        <w:tc>
+          <w:tcPr>
+            <w:tcW w:w="3690" w:type="dxa"/>
+            <w:tcBorders>
+              <w:top w:val="single" w:sz="4" w:space="0" w:color="ED7D31" w:themeColor="accent2"/>
+              <w:left w:val="single" w:sz="4" w:space="0" w:color="ED7D31" w:themeColor="accent2"/>
+            </w:tcBorders>
+            <w:shd w:val="clear" w:color="auto" w:fill="FFFFFF" w:themeFill="background1"/>
+          </w:tcPr>
+          <w:p>
+            <w:pPr>
+              <w:rPr>
+                <w:rFonts w:cs="Arial"/>
+              </w:rPr>
+            </w:pPr>
+          </w:p>
+        </w:tc>
+      </w:tr>
+    </w:tbl>
+    <w:p>
+      <w:pPr>
+        <w:rPr>
+          <w:i/>
+          <w:iCs/>
+          <w:lang w:val="en-GB"/>
+        </w:rPr>
+      </w:pPr>
+    </w:p>
+    <w:p>
+      <w:pPr>
+        <w:pStyle w:val="Heading1"/>
+      </w:pPr>
+      <w:r>
+        <w:t>How I intended to teach the lesson and the purpose of each step</w:t>
+      </w:r>
+    </w:p>
+    <w:p>
+      <w:pPr>
+        <w:rPr>
+          <w:i/>
+          <w:iCs/>
+          <w:lang w:val="en-GB"/>
+        </w:rPr>
+      </w:pPr>
+      <w:r>
+        <w:rPr>
+          <w:i/>
+          <w:iCs/>
+          <w:lang w:val="en-GB"/>
+        </w:rPr>
+        <w:t>Share a lesson plan where you describe the purpose of each activity in the lesson. Make sure to describe 1) what students do and what you do and 2) how each step support students learning</w:t>
+      </w:r>
+    </w:p>
+    <w:p>
+      <w:pPr>
+        <w:pStyle w:val="Heading1"/>
       </w:pPr>
       <w:r>
         <w:lastRenderedPageBreak/>
@@ -713,7 +2754,7 @@
     </w:p>
     <w:p>
       <w:pPr>
-        <w:pStyle w:val="Overskrift1"/>
+        <w:pStyle w:val="Heading1"/>
       </w:pPr>
       <w:r>
         <w:t xml:space="preserve">What it looked like </w:t>
@@ -746,7 +2787,7 @@
     </w:p>
     <w:p>
       <w:pPr>
-        <w:pStyle w:val="Overskrift1"/>
+        <w:pStyle w:val="Heading1"/>
       </w:pPr>
       <w:r>
         <w:t>My experience from teaching the lesson</w:t>
@@ -766,12 +2807,30 @@
           <w:iCs/>
           <w:lang w:val="en-GB"/>
         </w:rPr>
-        <w:t>Describe how it actually went. Did you have to adjust the plan as you went along? What did students do? What did you do? Did something surprise you?</w:t>
+        <w:t xml:space="preserve">Describe how it </w:t>
+      </w:r>
+      <w:proofErr w:type="gramStart"/>
+      <w:r>
+        <w:rPr>
+          <w:i/>
+          <w:iCs/>
+          <w:lang w:val="en-GB"/>
+        </w:rPr>
+        <w:t>actually went</w:t>
+      </w:r>
+      <w:proofErr w:type="gramEnd"/>
+      <w:r>
+        <w:rPr>
+          <w:i/>
+          <w:iCs/>
+          <w:lang w:val="en-GB"/>
+        </w:rPr>
+        <w:t>. Did you have to adjust the plan as you went along? What did students do? What did you do? Did something surprise you?</w:t>
       </w:r>
     </w:p>
     <w:p>
       <w:pPr>
-        <w:pStyle w:val="Overskrift1"/>
+        <w:pStyle w:val="Heading1"/>
       </w:pPr>
       <w:r>
         <w:t>What I would change next time</w:t>
@@ -809,7 +2868,7 @@
     </w:p>
     <w:tbl>
       <w:tblPr>
-        <w:tblStyle w:val="Tabel-Gitter"/>
+        <w:tblStyle w:val="TableGrid"/>
         <w:tblW w:w="9640" w:type="dxa"/>
         <w:tblInd w:w="-284" w:type="dxa"/>
         <w:tblBorders>
@@ -837,7 +2896,7 @@
           </w:tcPr>
           <w:p>
             <w:pPr>
-              <w:pStyle w:val="Overskrift1"/>
+              <w:pStyle w:val="Heading1"/>
             </w:pPr>
             <w:r>
               <w:t>My top 3 pieces of advice on teaching this lesson and course</w:t>
@@ -922,7 +2981,7 @@
     </w:tbl>
     <w:p>
       <w:pPr>
-        <w:pStyle w:val="Overskrift1"/>
+        <w:pStyle w:val="Heading1"/>
       </w:pPr>
       <w:r>
         <w:t>References</w:t>
@@ -1137,13 +3196,13 @@
     <w:sdtContent>
       <w:p>
         <w:pPr>
-          <w:pStyle w:val="Sidefod"/>
+          <w:pStyle w:val="Footer"/>
           <w:jc w:val="center"/>
         </w:pPr>
       </w:p>
       <w:tbl>
         <w:tblPr>
-          <w:tblStyle w:val="Tabel-Gitter"/>
+          <w:tblStyle w:val="TableGrid"/>
           <w:tblW w:w="11340" w:type="dxa"/>
           <w:tblInd w:w="-1134" w:type="dxa"/>
           <w:tblBorders>
@@ -1172,7 +3231,7 @@
             </w:tcPr>
             <w:p>
               <w:pPr>
-                <w:pStyle w:val="Sidefod"/>
+                <w:pStyle w:val="Footer"/>
               </w:pPr>
             </w:p>
           </w:tc>
@@ -1183,7 +3242,7 @@
             </w:tcPr>
             <w:p>
               <w:pPr>
-                <w:pStyle w:val="Sidefod"/>
+                <w:pStyle w:val="Footer"/>
                 <w:jc w:val="center"/>
               </w:pPr>
               <w:r>
@@ -1215,7 +3274,7 @@
             </w:tcPr>
             <w:p>
               <w:pPr>
-                <w:pStyle w:val="Sidefod"/>
+                <w:pStyle w:val="Footer"/>
                 <w:jc w:val="right"/>
               </w:pPr>
               <w:r>
@@ -1273,7 +3332,7 @@
   </w:sdt>
   <w:p>
     <w:pPr>
-      <w:pStyle w:val="Sidefod"/>
+      <w:pStyle w:val="Footer"/>
       <w:rPr>
         <w:sz w:val="2"/>
         <w:szCs w:val="2"/>
@@ -1312,7 +3371,7 @@
 <w:hdr xmlns:wpc="http://schemas.microsoft.com/office/word/2010/wordprocessingCanvas" xmlns:cx="http://schemas.microsoft.com/office/drawing/2014/chartex" xmlns:cx1="http://schemas.microsoft.com/office/drawing/2015/9/8/chartex" xmlns:cx2="http://schemas.microsoft.com/office/drawing/2015/10/21/chartex" xmlns:cx3="http://schemas.microsoft.com/office/drawing/2016/5/9/chartex" xmlns:cx4="http://schemas.microsoft.com/office/drawing/2016/5/10/chartex" xmlns:cx5="http://schemas.microsoft.com/office/drawing/2016/5/11/chartex" xmlns:cx6="http://schemas.microsoft.com/office/drawing/2016/5/12/chartex" xmlns:cx7="http://schemas.microsoft.com/office/drawing/2016/5/13/chartex" xmlns:cx8="http://schemas.microsoft.com/office/drawing/2016/5/14/chartex" xmlns:mc="http://schemas.openxmlformats.org/markup-compatibility/2006" xmlns:aink="http://schemas.microsoft.com/office/drawing/2016/ink" xmlns:am3d="http://schemas.microsoft.com/office/drawing/2017/model3d" xmlns:o="urn:schemas-microsoft-com:office:office" xmlns:oel="http://schemas.microsoft.com/office/2019/extlst" xmlns:r="http://schemas.openxmlformats.org/officeDocument/2006/relationships" xmlns:m="http://schemas.openxmlformats.org/officeDocument/2006/math" xmlns:v="urn:schemas-microsoft-com:vml" xmlns:wp14="http://schemas.microsoft.com/office/word/2010/wordprocessingDrawing" xmlns:wp="http://schemas.openxmlformats.org/drawingml/2006/wordprocessingDrawing" xmlns:w10="urn:schemas-microsoft-com:office:word" xmlns:w="http://schemas.openxmlformats.org/wordprocessingml/2006/main" xmlns:w14="http://schemas.microsoft.com/office/word/2010/wordml" xmlns:w15="http://schemas.microsoft.com/office/word/2012/wordml" xmlns:w16cex="http://schemas.microsoft.com/office/word/2018/wordml/cex" xmlns:w16cid="http://schemas.microsoft.com/office/word/2016/wordml/cid" xmlns:w16="http://schemas.microsoft.com/office/word/2018/wordml" xmlns:w16du="http://schemas.microsoft.com/office/word/2023/wordml/word16du" xmlns:w16sdtdh="http://schemas.microsoft.com/office/word/2020/wordml/sdtdatahash" xmlns:w16sdtfl="http://schemas.microsoft.com/office/word/2024/wordml/sdtformatlock" xmlns:w16se="http://schemas.microsoft.com/office/word/2015/wordml/symex" xmlns:wpg="http://schemas.microsoft.com/office/word/2010/wordprocessingGroup" xmlns:wpi="http://schemas.microsoft.com/office/word/2010/wordprocessingInk" xmlns:wne="http://schemas.microsoft.com/office/word/2006/wordml" xmlns:wps="http://schemas.microsoft.com/office/word/2010/wordprocessingShape" mc:Ignorable="w14 w15 w16se w16cid w16 w16cex w16sdtdh w16sdtfl w16du wp14">
   <w:p>
     <w:pPr>
-      <w:pStyle w:val="Titel"/>
+      <w:pStyle w:val="Title"/>
       <w:rPr>
         <w:b/>
         <w:bCs/>
@@ -1325,7 +3384,7 @@
   </w:p>
   <w:p>
     <w:pPr>
-      <w:pStyle w:val="Titel"/>
+      <w:pStyle w:val="Title"/>
       <w:rPr>
         <w:b/>
         <w:bCs/>
@@ -1382,7 +3441,7 @@
   </w:p>
   <w:p>
     <w:pPr>
-      <w:pStyle w:val="Sidehoved"/>
+      <w:pStyle w:val="Header"/>
       <w:rPr>
         <w:sz w:val="32"/>
         <w:lang w:val="en-GB"/>
@@ -1401,7 +3460,7 @@
     <w:lvl w:ilvl="0" w:tplc="AD58A2F0">
       <w:start w:val="1"/>
       <w:numFmt w:val="decimal"/>
-      <w:pStyle w:val="Overskrift1"/>
+      <w:pStyle w:val="Heading1"/>
       <w:lvlText w:val="%1."/>
       <w:lvlJc w:val="left"/>
       <w:pPr>
@@ -1485,6 +3544,119 @@
     </w:lvl>
   </w:abstractNum>
   <w:abstractNum w:abstractNumId="1" w15:restartNumberingAfterBreak="0">
+    <w:nsid w:val="22B377CE"/>
+    <w:multiLevelType w:val="hybridMultilevel"/>
+    <w:tmpl w:val="B07ACAF0"/>
+    <w:lvl w:ilvl="0" w:tplc="95CAE5F0">
+      <w:numFmt w:val="bullet"/>
+      <w:lvlText w:val="-"/>
+      <w:lvlJc w:val="left"/>
+      <w:pPr>
+        <w:ind w:left="720" w:hanging="360"/>
+      </w:pPr>
+      <w:rPr>
+        <w:rFonts w:ascii="AU Passata" w:eastAsiaTheme="minorHAnsi" w:hAnsi="AU Passata" w:cs="Arial" w:hint="default"/>
+        <w:b/>
+      </w:rPr>
+    </w:lvl>
+    <w:lvl w:ilvl="1" w:tplc="04060003" w:tentative="1">
+      <w:start w:val="1"/>
+      <w:numFmt w:val="bullet"/>
+      <w:lvlText w:val="o"/>
+      <w:lvlJc w:val="left"/>
+      <w:pPr>
+        <w:ind w:left="1440" w:hanging="360"/>
+      </w:pPr>
+      <w:rPr>
+        <w:rFonts w:ascii="Courier New" w:hAnsi="Courier New" w:cs="Courier New" w:hint="default"/>
+      </w:rPr>
+    </w:lvl>
+    <w:lvl w:ilvl="2" w:tplc="04060005" w:tentative="1">
+      <w:start w:val="1"/>
+      <w:numFmt w:val="bullet"/>
+      <w:lvlText w:val=""/>
+      <w:lvlJc w:val="left"/>
+      <w:pPr>
+        <w:ind w:left="2160" w:hanging="360"/>
+      </w:pPr>
+      <w:rPr>
+        <w:rFonts w:ascii="Wingdings" w:hAnsi="Wingdings" w:hint="default"/>
+      </w:rPr>
+    </w:lvl>
+    <w:lvl w:ilvl="3" w:tplc="04060001" w:tentative="1">
+      <w:start w:val="1"/>
+      <w:numFmt w:val="bullet"/>
+      <w:lvlText w:val=""/>
+      <w:lvlJc w:val="left"/>
+      <w:pPr>
+        <w:ind w:left="2880" w:hanging="360"/>
+      </w:pPr>
+      <w:rPr>
+        <w:rFonts w:ascii="Symbol" w:hAnsi="Symbol" w:hint="default"/>
+      </w:rPr>
+    </w:lvl>
+    <w:lvl w:ilvl="4" w:tplc="04060003" w:tentative="1">
+      <w:start w:val="1"/>
+      <w:numFmt w:val="bullet"/>
+      <w:lvlText w:val="o"/>
+      <w:lvlJc w:val="left"/>
+      <w:pPr>
+        <w:ind w:left="3600" w:hanging="360"/>
+      </w:pPr>
+      <w:rPr>
+        <w:rFonts w:ascii="Courier New" w:hAnsi="Courier New" w:cs="Courier New" w:hint="default"/>
+      </w:rPr>
+    </w:lvl>
+    <w:lvl w:ilvl="5" w:tplc="04060005" w:tentative="1">
+      <w:start w:val="1"/>
+      <w:numFmt w:val="bullet"/>
+      <w:lvlText w:val=""/>
+      <w:lvlJc w:val="left"/>
+      <w:pPr>
+        <w:ind w:left="4320" w:hanging="360"/>
+      </w:pPr>
+      <w:rPr>
+        <w:rFonts w:ascii="Wingdings" w:hAnsi="Wingdings" w:hint="default"/>
+      </w:rPr>
+    </w:lvl>
+    <w:lvl w:ilvl="6" w:tplc="04060001" w:tentative="1">
+      <w:start w:val="1"/>
+      <w:numFmt w:val="bullet"/>
+      <w:lvlText w:val=""/>
+      <w:lvlJc w:val="left"/>
+      <w:pPr>
+        <w:ind w:left="5040" w:hanging="360"/>
+      </w:pPr>
+      <w:rPr>
+        <w:rFonts w:ascii="Symbol" w:hAnsi="Symbol" w:hint="default"/>
+      </w:rPr>
+    </w:lvl>
+    <w:lvl w:ilvl="7" w:tplc="04060003" w:tentative="1">
+      <w:start w:val="1"/>
+      <w:numFmt w:val="bullet"/>
+      <w:lvlText w:val="o"/>
+      <w:lvlJc w:val="left"/>
+      <w:pPr>
+        <w:ind w:left="5760" w:hanging="360"/>
+      </w:pPr>
+      <w:rPr>
+        <w:rFonts w:ascii="Courier New" w:hAnsi="Courier New" w:cs="Courier New" w:hint="default"/>
+      </w:rPr>
+    </w:lvl>
+    <w:lvl w:ilvl="8" w:tplc="04060005" w:tentative="1">
+      <w:start w:val="1"/>
+      <w:numFmt w:val="bullet"/>
+      <w:lvlText w:val=""/>
+      <w:lvlJc w:val="left"/>
+      <w:pPr>
+        <w:ind w:left="6480" w:hanging="360"/>
+      </w:pPr>
+      <w:rPr>
+        <w:rFonts w:ascii="Wingdings" w:hAnsi="Wingdings" w:hint="default"/>
+      </w:rPr>
+    </w:lvl>
+  </w:abstractNum>
+  <w:abstractNum w:abstractNumId="2" w15:restartNumberingAfterBreak="0">
     <w:nsid w:val="715C3654"/>
     <w:multiLevelType w:val="hybridMultilevel"/>
     <w:tmpl w:val="D5FE119E"/>
@@ -1570,7 +3742,7 @@
       </w:pPr>
     </w:lvl>
   </w:abstractNum>
-  <w:abstractNum w:abstractNumId="2" w15:restartNumberingAfterBreak="0">
+  <w:abstractNum w:abstractNumId="3" w15:restartNumberingAfterBreak="0">
     <w:nsid w:val="716E5149"/>
     <w:multiLevelType w:val="hybridMultilevel"/>
     <w:tmpl w:val="87A4038A"/>
@@ -1658,13 +3830,16 @@
     </w:lvl>
   </w:abstractNum>
   <w:num w:numId="1" w16cid:durableId="1379234161">
-    <w:abstractNumId w:val="1"/>
+    <w:abstractNumId w:val="2"/>
   </w:num>
   <w:num w:numId="2" w16cid:durableId="767042348">
     <w:abstractNumId w:val="0"/>
   </w:num>
   <w:num w:numId="3" w16cid:durableId="387075984">
-    <w:abstractNumId w:val="2"/>
+    <w:abstractNumId w:val="3"/>
+  </w:num>
+  <w:num w:numId="4" w16cid:durableId="182985801">
+    <w:abstractNumId w:val="1"/>
   </w:num>
 </w:numbering>
 </file>
@@ -1866,7 +4041,7 @@
     <w:lsdException w:name="Medium Shading 2 Accent 1" w:uiPriority="64"/>
     <w:lsdException w:name="Medium List 1 Accent 1" w:uiPriority="65"/>
     <w:lsdException w:name="Revision" w:semiHidden="1"/>
-    <w:lsdException w:name="List Paragraph" w:uiPriority="34"/>
+    <w:lsdException w:name="List Paragraph" w:uiPriority="34" w:qFormat="1"/>
     <w:lsdException w:name="Quote" w:uiPriority="29"/>
     <w:lsdException w:name="Intense Quote" w:uiPriority="30"/>
     <w:lsdException w:name="Medium List 2 Accent 1" w:uiPriority="66"/>
@@ -2075,11 +4250,11 @@
       <w:rFonts w:ascii="AU Passata" w:hAnsi="AU Passata"/>
     </w:rPr>
   </w:style>
-  <w:style w:type="paragraph" w:styleId="Overskrift1">
+  <w:style w:type="paragraph" w:styleId="Heading1">
     <w:name w:val="heading 1"/>
     <w:basedOn w:val="Normal"/>
     <w:next w:val="Normal"/>
-    <w:link w:val="Overskrift1Tegn"/>
+    <w:link w:val="Heading1Char"/>
     <w:uiPriority w:val="9"/>
     <w:qFormat/>
     <w:rsid w:val="000941F3"/>
@@ -2103,13 +4278,13 @@
       <w:lang w:val="en-GB"/>
     </w:rPr>
   </w:style>
-  <w:style w:type="character" w:default="1" w:styleId="Standardskrifttypeiafsnit">
+  <w:style w:type="character" w:default="1" w:styleId="DefaultParagraphFont">
     <w:name w:val="Default Paragraph Font"/>
     <w:uiPriority w:val="1"/>
     <w:semiHidden/>
     <w:unhideWhenUsed/>
   </w:style>
-  <w:style w:type="table" w:default="1" w:styleId="Tabel-Normal">
+  <w:style w:type="table" w:default="1" w:styleId="TableNormal">
     <w:name w:val="Normal Table"/>
     <w:uiPriority w:val="99"/>
     <w:semiHidden/>
@@ -2124,16 +4299,16 @@
       </w:tblCellMar>
     </w:tblPr>
   </w:style>
-  <w:style w:type="numbering" w:default="1" w:styleId="Ingenoversigt">
+  <w:style w:type="numbering" w:default="1" w:styleId="NoList">
     <w:name w:val="No List"/>
     <w:uiPriority w:val="99"/>
     <w:semiHidden/>
     <w:unhideWhenUsed/>
   </w:style>
-  <w:style w:type="paragraph" w:styleId="Titel">
+  <w:style w:type="paragraph" w:styleId="Title">
     <w:name w:val="Title"/>
     <w:next w:val="Normal"/>
-    <w:link w:val="TitelTegn"/>
+    <w:link w:val="TitleChar"/>
     <w:uiPriority w:val="10"/>
     <w:qFormat/>
     <w:rsid w:val="00D422E9"/>
@@ -2150,10 +4325,10 @@
       <w:szCs w:val="56"/>
     </w:rPr>
   </w:style>
-  <w:style w:type="character" w:customStyle="1" w:styleId="TitelTegn">
-    <w:name w:val="Titel Tegn"/>
-    <w:basedOn w:val="Standardskrifttypeiafsnit"/>
-    <w:link w:val="Titel"/>
+  <w:style w:type="character" w:customStyle="1" w:styleId="TitleChar">
+    <w:name w:val="Title Char"/>
+    <w:basedOn w:val="DefaultParagraphFont"/>
+    <w:link w:val="Title"/>
     <w:uiPriority w:val="10"/>
     <w:rsid w:val="00D422E9"/>
     <w:rPr>
@@ -2165,10 +4340,11 @@
       <w:szCs w:val="56"/>
     </w:rPr>
   </w:style>
-  <w:style w:type="paragraph" w:styleId="Listeafsnit">
+  <w:style w:type="paragraph" w:styleId="ListParagraph">
     <w:name w:val="List Paragraph"/>
     <w:basedOn w:val="Normal"/>
     <w:uiPriority w:val="34"/>
+    <w:qFormat/>
     <w:rsid w:val="00D422E9"/>
     <w:pPr>
       <w:ind w:left="720"/>
@@ -2185,7 +4361,7 @@
   </w:style>
   <w:style w:type="paragraph" w:customStyle="1" w:styleId="Yourname">
     <w:name w:val="Your name"/>
-    <w:basedOn w:val="Titel"/>
+    <w:basedOn w:val="Title"/>
     <w:link w:val="YournameChar"/>
     <w:qFormat/>
     <w:rsid w:val="00D422E9"/>
@@ -2198,10 +4374,10 @@
       <w:lang w:val="en-US"/>
     </w:rPr>
   </w:style>
-  <w:style w:type="character" w:customStyle="1" w:styleId="Overskrift1Tegn">
-    <w:name w:val="Overskrift 1 Tegn"/>
-    <w:basedOn w:val="Standardskrifttypeiafsnit"/>
-    <w:link w:val="Overskrift1"/>
+  <w:style w:type="character" w:customStyle="1" w:styleId="Heading1Char">
+    <w:name w:val="Heading 1 Char"/>
+    <w:basedOn w:val="DefaultParagraphFont"/>
+    <w:link w:val="Heading1"/>
     <w:uiPriority w:val="9"/>
     <w:rsid w:val="000941F3"/>
     <w:rPr>
@@ -2213,7 +4389,7 @@
   </w:style>
   <w:style w:type="character" w:customStyle="1" w:styleId="YournameChar">
     <w:name w:val="Your name Char"/>
-    <w:basedOn w:val="TitelTegn"/>
+    <w:basedOn w:val="TitleChar"/>
     <w:link w:val="Yourname"/>
     <w:rsid w:val="00D422E9"/>
     <w:rPr>
@@ -2226,10 +4402,10 @@
       <w:lang w:val="en-US"/>
     </w:rPr>
   </w:style>
-  <w:style w:type="paragraph" w:styleId="Sidehoved">
+  <w:style w:type="paragraph" w:styleId="Header">
     <w:name w:val="header"/>
     <w:basedOn w:val="Normal"/>
-    <w:link w:val="SidehovedTegn"/>
+    <w:link w:val="HeaderChar"/>
     <w:uiPriority w:val="99"/>
     <w:unhideWhenUsed/>
     <w:rsid w:val="00D422E9"/>
@@ -2241,20 +4417,20 @@
       <w:spacing w:before="0" w:line="240" w:lineRule="auto"/>
     </w:pPr>
   </w:style>
-  <w:style w:type="character" w:customStyle="1" w:styleId="SidehovedTegn">
-    <w:name w:val="Sidehoved Tegn"/>
-    <w:basedOn w:val="Standardskrifttypeiafsnit"/>
-    <w:link w:val="Sidehoved"/>
+  <w:style w:type="character" w:customStyle="1" w:styleId="HeaderChar">
+    <w:name w:val="Header Char"/>
+    <w:basedOn w:val="DefaultParagraphFont"/>
+    <w:link w:val="Header"/>
     <w:uiPriority w:val="99"/>
     <w:rsid w:val="00D422E9"/>
     <w:rPr>
       <w:rFonts w:ascii="AU Passata" w:hAnsi="AU Passata"/>
     </w:rPr>
   </w:style>
-  <w:style w:type="paragraph" w:styleId="Sidefod">
+  <w:style w:type="paragraph" w:styleId="Footer">
     <w:name w:val="footer"/>
     <w:basedOn w:val="Normal"/>
-    <w:link w:val="SidefodTegn"/>
+    <w:link w:val="FooterChar"/>
     <w:uiPriority w:val="99"/>
     <w:unhideWhenUsed/>
     <w:rsid w:val="00D422E9"/>
@@ -2266,19 +4442,19 @@
       <w:spacing w:before="0" w:line="240" w:lineRule="auto"/>
     </w:pPr>
   </w:style>
-  <w:style w:type="character" w:customStyle="1" w:styleId="SidefodTegn">
-    <w:name w:val="Sidefod Tegn"/>
-    <w:basedOn w:val="Standardskrifttypeiafsnit"/>
-    <w:link w:val="Sidefod"/>
+  <w:style w:type="character" w:customStyle="1" w:styleId="FooterChar">
+    <w:name w:val="Footer Char"/>
+    <w:basedOn w:val="DefaultParagraphFont"/>
+    <w:link w:val="Footer"/>
     <w:uiPriority w:val="99"/>
     <w:rsid w:val="00D422E9"/>
     <w:rPr>
       <w:rFonts w:ascii="AU Passata" w:hAnsi="AU Passata"/>
     </w:rPr>
   </w:style>
-  <w:style w:type="table" w:styleId="Tabel-Gitter">
+  <w:style w:type="table" w:styleId="TableGrid">
     <w:name w:val="Table Grid"/>
-    <w:basedOn w:val="Tabel-Normal"/>
+    <w:basedOn w:val="TableNormal"/>
     <w:uiPriority w:val="39"/>
     <w:rsid w:val="00D422E9"/>
     <w:pPr>
@@ -2297,7 +4473,7 @@
   </w:style>
   <w:style w:type="paragraph" w:customStyle="1" w:styleId="Numbering">
     <w:name w:val="Numbering"/>
-    <w:basedOn w:val="Listeafsnit"/>
+    <w:basedOn w:val="ListParagraph"/>
     <w:qFormat/>
     <w:rsid w:val="000F720E"/>
     <w:pPr>

</xml_diff>